<commit_message>
ppt and word added
</commit_message>
<xml_diff>
--- a/prompt forge.docx
+++ b/prompt forge.docx
@@ -846,12 +846,1686 @@
         <w:rPr>
           <w:b/>
           <w:bCs/>
+          <w:sz w:val="40"/>
+          <w:szCs w:val="40"/>
+          <w:lang w:val="en-IN"/>
+        </w:rPr>
+      </w:pPr>
+      <w:r>
+        <w:rPr>
+          <w:b/>
+          <w:bCs/>
+          <w:sz w:val="40"/>
+          <w:szCs w:val="40"/>
+          <w:lang w:val="en-IN"/>
+        </w:rPr>
+        <w:t>Endpoint: /run-workflow</w:t>
+      </w:r>
+    </w:p>
+    <w:p>
+      <w:pPr>
+        <w:numPr>
+          <w:ilvl w:val="0"/>
+          <w:numId w:val="50"/>
+        </w:numPr>
+        <w:rPr>
+          <w:lang w:val="en-IN"/>
+        </w:rPr>
+      </w:pPr>
+      <w:r>
+        <w:rPr>
+          <w:b/>
+          <w:bCs/>
+          <w:lang w:val="en-IN"/>
+        </w:rPr>
+        <w:t>URL:</w:t>
+      </w:r>
+      <w:r>
+        <w:rPr>
+          <w:lang w:val="en-IN"/>
+        </w:rPr>
+        <w:t xml:space="preserve"> http://127.0.0.1:8000/run-workflow</w:t>
+      </w:r>
+    </w:p>
+    <w:p>
+      <w:pPr>
+        <w:numPr>
+          <w:ilvl w:val="0"/>
+          <w:numId w:val="50"/>
+        </w:numPr>
+        <w:rPr>
+          <w:lang w:val="en-IN"/>
+        </w:rPr>
+      </w:pPr>
+      <w:r>
+        <w:rPr>
+          <w:b/>
+          <w:bCs/>
+          <w:lang w:val="en-IN"/>
+        </w:rPr>
+        <w:t>Method:</w:t>
+      </w:r>
+      <w:r>
+        <w:rPr>
+          <w:lang w:val="en-IN"/>
+        </w:rPr>
+        <w:t xml:space="preserve"> POST</w:t>
+      </w:r>
+    </w:p>
+    <w:p>
+      <w:pPr>
+        <w:numPr>
+          <w:ilvl w:val="0"/>
+          <w:numId w:val="50"/>
+        </w:numPr>
+        <w:rPr>
+          <w:lang w:val="en-IN"/>
+        </w:rPr>
+      </w:pPr>
+      <w:r>
+        <w:rPr>
+          <w:b/>
+          <w:bCs/>
+          <w:lang w:val="en-IN"/>
+        </w:rPr>
+        <w:t>Headers:</w:t>
+      </w:r>
+      <w:r>
+        <w:rPr>
+          <w:lang w:val="en-IN"/>
+        </w:rPr>
+        <w:br/>
+        <w:t>Content-Type: application/</w:t>
+      </w:r>
+      <w:proofErr w:type="spellStart"/>
+      <w:r>
+        <w:rPr>
+          <w:lang w:val="en-IN"/>
+        </w:rPr>
+        <w:t>json</w:t>
+      </w:r>
+      <w:proofErr w:type="spellEnd"/>
+    </w:p>
+    <w:p>
+      <w:pPr>
+        <w:rPr>
+          <w:lang w:val="en-IN"/>
+        </w:rPr>
+      </w:pPr>
+    </w:p>
+    <w:p>
+      <w:pPr>
+        <w:rPr>
+          <w:b/>
+          <w:bCs/>
+          <w:lang w:val="en-IN"/>
+        </w:rPr>
+      </w:pPr>
+      <w:r>
+        <w:rPr>
+          <w:rFonts w:ascii="Segoe UI Emoji" w:hAnsi="Segoe UI Emoji" w:cs="Segoe UI Emoji"/>
+          <w:b/>
+          <w:bCs/>
+          <w:lang w:val="en-IN"/>
+        </w:rPr>
+        <w:t>🔻</w:t>
+      </w:r>
+      <w:r>
+        <w:rPr>
+          <w:b/>
+          <w:bCs/>
+          <w:lang w:val="en-IN"/>
+        </w:rPr>
+        <w:t xml:space="preserve"> Request Body (raw JSON)</w:t>
+      </w:r>
+    </w:p>
+    <w:p>
+      <w:pPr>
+        <w:rPr>
+          <w:lang w:val="en-IN"/>
+        </w:rPr>
+      </w:pPr>
+      <w:r>
+        <w:rPr>
+          <w:lang w:val="en-IN"/>
+        </w:rPr>
+        <w:t>{</w:t>
+      </w:r>
+    </w:p>
+    <w:p>
+      <w:pPr>
+        <w:rPr>
+          <w:lang w:val="en-IN"/>
+        </w:rPr>
+      </w:pPr>
+      <w:r>
+        <w:rPr>
+          <w:lang w:val="en-IN"/>
+        </w:rPr>
+        <w:t xml:space="preserve">  "name": "Scrape and Email News",</w:t>
+      </w:r>
+    </w:p>
+    <w:p>
+      <w:pPr>
+        <w:rPr>
+          <w:lang w:val="en-IN"/>
+        </w:rPr>
+      </w:pPr>
+      <w:r>
+        <w:rPr>
+          <w:lang w:val="en-IN"/>
+        </w:rPr>
+        <w:t xml:space="preserve">  "steps": [</w:t>
+      </w:r>
+    </w:p>
+    <w:p>
+      <w:pPr>
+        <w:rPr>
+          <w:lang w:val="en-IN"/>
+        </w:rPr>
+      </w:pPr>
+      <w:r>
+        <w:rPr>
+          <w:lang w:val="en-IN"/>
+        </w:rPr>
+        <w:t xml:space="preserve">    {</w:t>
+      </w:r>
+    </w:p>
+    <w:p>
+      <w:pPr>
+        <w:rPr>
+          <w:lang w:val="en-IN"/>
+        </w:rPr>
+      </w:pPr>
+      <w:r>
+        <w:rPr>
+          <w:lang w:val="en-IN"/>
+        </w:rPr>
+        <w:t xml:space="preserve">      "tool": "</w:t>
+      </w:r>
+      <w:proofErr w:type="spellStart"/>
+      <w:r>
+        <w:rPr>
+          <w:lang w:val="en-IN"/>
+        </w:rPr>
+        <w:t>scrape_website</w:t>
+      </w:r>
+      <w:proofErr w:type="spellEnd"/>
+      <w:r>
+        <w:rPr>
+          <w:lang w:val="en-IN"/>
+        </w:rPr>
+        <w:t>",</w:t>
+      </w:r>
+    </w:p>
+    <w:p>
+      <w:pPr>
+        <w:rPr>
+          <w:lang w:val="en-IN"/>
+        </w:rPr>
+      </w:pPr>
+      <w:r>
+        <w:rPr>
+          <w:lang w:val="en-IN"/>
+        </w:rPr>
+        <w:t xml:space="preserve">      "input": {</w:t>
+      </w:r>
+    </w:p>
+    <w:p>
+      <w:pPr>
+        <w:rPr>
+          <w:lang w:val="en-IN"/>
+        </w:rPr>
+      </w:pPr>
+      <w:r>
+        <w:rPr>
+          <w:lang w:val="en-IN"/>
+        </w:rPr>
+        <w:t xml:space="preserve">        "</w:t>
+      </w:r>
+      <w:proofErr w:type="spellStart"/>
+      <w:r>
+        <w:rPr>
+          <w:lang w:val="en-IN"/>
+        </w:rPr>
+        <w:t>url</w:t>
+      </w:r>
+      <w:proofErr w:type="spellEnd"/>
+      <w:r>
+        <w:rPr>
+          <w:lang w:val="en-IN"/>
+        </w:rPr>
+        <w:t>": "https://www.bbc.com/news"</w:t>
+      </w:r>
+    </w:p>
+    <w:p>
+      <w:pPr>
+        <w:rPr>
+          <w:lang w:val="en-IN"/>
+        </w:rPr>
+      </w:pPr>
+      <w:r>
+        <w:rPr>
+          <w:lang w:val="en-IN"/>
+        </w:rPr>
+        <w:t xml:space="preserve">      }</w:t>
+      </w:r>
+    </w:p>
+    <w:p>
+      <w:pPr>
+        <w:rPr>
+          <w:lang w:val="en-IN"/>
+        </w:rPr>
+      </w:pPr>
+      <w:r>
+        <w:rPr>
+          <w:lang w:val="en-IN"/>
+        </w:rPr>
+        <w:t xml:space="preserve">    },</w:t>
+      </w:r>
+    </w:p>
+    <w:p>
+      <w:pPr>
+        <w:rPr>
+          <w:lang w:val="en-IN"/>
+        </w:rPr>
+      </w:pPr>
+      <w:r>
+        <w:rPr>
+          <w:lang w:val="en-IN"/>
+        </w:rPr>
+        <w:lastRenderedPageBreak/>
+        <w:t xml:space="preserve">    {</w:t>
+      </w:r>
+    </w:p>
+    <w:p>
+      <w:pPr>
+        <w:rPr>
+          <w:lang w:val="en-IN"/>
+        </w:rPr>
+      </w:pPr>
+      <w:r>
+        <w:rPr>
+          <w:lang w:val="en-IN"/>
+        </w:rPr>
+        <w:t xml:space="preserve">      "tool": "</w:t>
+      </w:r>
+      <w:proofErr w:type="spellStart"/>
+      <w:r>
+        <w:rPr>
+          <w:lang w:val="en-IN"/>
+        </w:rPr>
+        <w:t>send_email</w:t>
+      </w:r>
+      <w:proofErr w:type="spellEnd"/>
+      <w:r>
+        <w:rPr>
+          <w:lang w:val="en-IN"/>
+        </w:rPr>
+        <w:t>",</w:t>
+      </w:r>
+    </w:p>
+    <w:p>
+      <w:pPr>
+        <w:rPr>
+          <w:lang w:val="en-IN"/>
+        </w:rPr>
+      </w:pPr>
+      <w:r>
+        <w:rPr>
+          <w:lang w:val="en-IN"/>
+        </w:rPr>
+        <w:t xml:space="preserve">      "input": {</w:t>
+      </w:r>
+    </w:p>
+    <w:p>
+      <w:pPr>
+        <w:rPr>
+          <w:lang w:val="en-IN"/>
+        </w:rPr>
+      </w:pPr>
+      <w:r>
+        <w:rPr>
+          <w:lang w:val="en-IN"/>
+        </w:rPr>
+        <w:t xml:space="preserve">        "to": "</w:t>
+      </w:r>
+      <w:proofErr w:type="gramStart"/>
+      <w:r>
+        <w:rPr>
+          <w:lang w:val="en-IN"/>
+        </w:rPr>
+        <w:t>nareshacharya2701@gmail.com,pampanuriyeswanth@gmail.com</w:t>
+      </w:r>
+      <w:proofErr w:type="gramEnd"/>
+      <w:r>
+        <w:rPr>
+          <w:lang w:val="en-IN"/>
+        </w:rPr>
+        <w:t>,indravarma8688@gmail.com",</w:t>
+      </w:r>
+    </w:p>
+    <w:p>
+      <w:pPr>
+        <w:rPr>
+          <w:lang w:val="en-IN"/>
+        </w:rPr>
+      </w:pPr>
+      <w:r>
+        <w:rPr>
+          <w:lang w:val="en-IN"/>
+        </w:rPr>
+        <w:t xml:space="preserve">        "subject": "Hi </w:t>
+      </w:r>
+      <w:proofErr w:type="spellStart"/>
+      <w:r>
+        <w:rPr>
+          <w:lang w:val="en-IN"/>
+        </w:rPr>
+        <w:t>Mawaassss</w:t>
+      </w:r>
+      <w:proofErr w:type="spellEnd"/>
+      <w:r>
+        <w:rPr>
+          <w:lang w:val="en-IN"/>
+        </w:rPr>
+        <w:t xml:space="preserve"> </w:t>
+      </w:r>
+      <w:proofErr w:type="spellStart"/>
+      <w:r>
+        <w:rPr>
+          <w:lang w:val="en-IN"/>
+        </w:rPr>
+        <w:t>Dongamokam</w:t>
+      </w:r>
+      <w:proofErr w:type="spellEnd"/>
+      <w:r>
+        <w:rPr>
+          <w:lang w:val="en-IN"/>
+        </w:rPr>
+        <w:t>",</w:t>
+      </w:r>
+    </w:p>
+    <w:p>
+      <w:pPr>
+        <w:rPr>
+          <w:lang w:val="en-IN"/>
+        </w:rPr>
+      </w:pPr>
+      <w:r>
+        <w:rPr>
+          <w:lang w:val="en-IN"/>
+        </w:rPr>
+        <w:t xml:space="preserve">        "body": "{{content}}"</w:t>
+      </w:r>
+    </w:p>
+    <w:p>
+      <w:pPr>
+        <w:rPr>
+          <w:lang w:val="en-IN"/>
+        </w:rPr>
+      </w:pPr>
+      <w:r>
+        <w:rPr>
+          <w:lang w:val="en-IN"/>
+        </w:rPr>
+        <w:t xml:space="preserve">      }</w:t>
+      </w:r>
+    </w:p>
+    <w:p>
+      <w:pPr>
+        <w:rPr>
+          <w:lang w:val="en-IN"/>
+        </w:rPr>
+      </w:pPr>
+      <w:r>
+        <w:rPr>
+          <w:lang w:val="en-IN"/>
+        </w:rPr>
+        <w:t xml:space="preserve">    }</w:t>
+      </w:r>
+    </w:p>
+    <w:p>
+      <w:pPr>
+        <w:rPr>
+          <w:lang w:val="en-IN"/>
+        </w:rPr>
+      </w:pPr>
+      <w:r>
+        <w:rPr>
+          <w:lang w:val="en-IN"/>
+        </w:rPr>
+        <w:t xml:space="preserve">  ]</w:t>
+      </w:r>
+    </w:p>
+    <w:p>
+      <w:pPr>
+        <w:rPr>
+          <w:lang w:val="en-IN"/>
+        </w:rPr>
+      </w:pPr>
+      <w:r>
+        <w:rPr>
+          <w:lang w:val="en-IN"/>
+        </w:rPr>
+        <w:t>}</w:t>
+      </w:r>
+    </w:p>
+    <w:p>
+      <w:pPr>
+        <w:rPr>
+          <w:lang w:val="en-IN"/>
+        </w:rPr>
+      </w:pPr>
+      <w:r>
+        <w:rPr>
+          <w:rFonts w:ascii="Segoe UI Emoji" w:hAnsi="Segoe UI Emoji" w:cs="Segoe UI Emoji"/>
+          <w:lang w:val="en-IN"/>
+        </w:rPr>
+        <w:t>#</w:t>
+      </w:r>
+      <w:r>
+        <w:rPr>
+          <w:lang w:val="en-IN"/>
+        </w:rPr>
+        <w:t xml:space="preserve"> {{content}} will be dynamically replaced by the output of the </w:t>
+      </w:r>
+      <w:proofErr w:type="spellStart"/>
+      <w:r>
+        <w:rPr>
+          <w:lang w:val="en-IN"/>
+        </w:rPr>
+        <w:t>scrape_website</w:t>
+      </w:r>
+      <w:proofErr w:type="spellEnd"/>
+      <w:r>
+        <w:rPr>
+          <w:lang w:val="en-IN"/>
+        </w:rPr>
+        <w:t xml:space="preserve"> step and used in the email body.</w:t>
+      </w:r>
+    </w:p>
+    <w:p>
+      <w:pPr>
+        <w:rPr>
+          <w:lang w:val="en-IN"/>
+        </w:rPr>
+      </w:pPr>
+      <w:r>
+        <w:rPr>
+          <w:b/>
+          <w:bCs/>
+          <w:lang w:val="en-IN"/>
+        </w:rPr>
+        <w:t>Run the Server First</w:t>
+      </w:r>
+    </w:p>
+    <w:p>
+      <w:pPr>
+        <w:rPr>
+          <w:lang w:val="en-IN"/>
+        </w:rPr>
+      </w:pPr>
+      <w:proofErr w:type="spellStart"/>
+      <w:r>
+        <w:rPr>
+          <w:lang w:val="en-IN"/>
+        </w:rPr>
+        <w:t>uvicorn</w:t>
+      </w:r>
+      <w:proofErr w:type="spellEnd"/>
+      <w:r>
+        <w:rPr>
+          <w:lang w:val="en-IN"/>
+        </w:rPr>
+        <w:t xml:space="preserve"> </w:t>
+      </w:r>
+      <w:proofErr w:type="spellStart"/>
+      <w:r>
+        <w:rPr>
+          <w:lang w:val="en-IN"/>
+        </w:rPr>
+        <w:t>main:app</w:t>
+      </w:r>
+      <w:proofErr w:type="spellEnd"/>
+      <w:r>
+        <w:rPr>
+          <w:lang w:val="en-IN"/>
+        </w:rPr>
+        <w:t xml:space="preserve"> --reload</w:t>
+      </w:r>
+    </w:p>
+    <w:p>
+      <w:pPr>
+        <w:rPr>
+          <w:lang w:val="en-IN"/>
+        </w:rPr>
+      </w:pPr>
+      <w:r>
+        <w:rPr>
+          <w:lang w:val="en-IN"/>
+        </w:rPr>
+        <w:t xml:space="preserve">Then test the endpoint using </w:t>
+      </w:r>
+      <w:r>
+        <w:rPr>
+          <w:b/>
+          <w:bCs/>
+          <w:lang w:val="en-IN"/>
+        </w:rPr>
+        <w:t>Postman</w:t>
+      </w:r>
+      <w:r>
+        <w:rPr>
+          <w:lang w:val="en-IN"/>
+        </w:rPr>
+        <w:t xml:space="preserve"> or </w:t>
+      </w:r>
+      <w:r>
+        <w:rPr>
+          <w:b/>
+          <w:bCs/>
+          <w:lang w:val="en-IN"/>
+        </w:rPr>
+        <w:t>curl</w:t>
+      </w:r>
+      <w:r>
+        <w:rPr>
+          <w:lang w:val="en-IN"/>
+        </w:rPr>
+        <w:t>.</w:t>
+      </w:r>
+    </w:p>
+    <w:p>
+      <w:pPr>
+        <w:rPr>
+          <w:b/>
+          <w:bCs/>
+          <w:sz w:val="48"/>
+          <w:szCs w:val="48"/>
+          <w:lang w:val="en-IN"/>
+        </w:rPr>
+      </w:pPr>
+      <w:r>
+        <w:rPr>
+          <w:b/>
+          <w:bCs/>
+          <w:sz w:val="48"/>
+          <w:szCs w:val="48"/>
+          <w:lang w:val="en-IN"/>
+        </w:rPr>
+        <w:t>Tech Stack</w:t>
+      </w:r>
+    </w:p>
+    <w:p>
+      <w:pPr>
+        <w:rPr>
+          <w:lang w:val="en-IN"/>
+        </w:rPr>
+      </w:pPr>
+    </w:p>
+    <w:p>
+      <w:pPr>
+        <w:rPr>
+          <w:lang w:val="en-IN"/>
+        </w:rPr>
+      </w:pPr>
+      <w:r>
+        <w:rPr>
+          <w:rFonts w:ascii="Segoe UI Emoji" w:hAnsi="Segoe UI Emoji" w:cs="Segoe UI Emoji"/>
+          <w:b/>
+          <w:bCs/>
+          <w:lang w:val="en-IN"/>
+        </w:rPr>
+        <w:t>🔹</w:t>
+      </w:r>
+      <w:r>
+        <w:rPr>
+          <w:b/>
+          <w:bCs/>
+          <w:lang w:val="en-IN"/>
+        </w:rPr>
+        <w:t xml:space="preserve"> Backend Framework</w:t>
+      </w:r>
+    </w:p>
+    <w:p>
+      <w:pPr>
+        <w:numPr>
+          <w:ilvl w:val="0"/>
+          <w:numId w:val="51"/>
+        </w:numPr>
+        <w:rPr>
+          <w:lang w:val="en-IN"/>
+        </w:rPr>
+      </w:pPr>
+      <w:r>
+        <w:rPr>
+          <w:b/>
+          <w:bCs/>
+          <w:lang w:val="en-IN"/>
+        </w:rPr>
+        <w:t>FastAPI</w:t>
+      </w:r>
+      <w:r>
+        <w:rPr>
+          <w:lang w:val="en-IN"/>
+        </w:rPr>
+        <w:t xml:space="preserve"> – For serving the API</w:t>
+      </w:r>
+    </w:p>
+    <w:p>
+      <w:pPr>
+        <w:numPr>
+          <w:ilvl w:val="0"/>
+          <w:numId w:val="51"/>
+        </w:numPr>
+        <w:rPr>
+          <w:lang w:val="en-IN"/>
+        </w:rPr>
+      </w:pPr>
+      <w:r>
+        <w:rPr>
+          <w:b/>
+          <w:bCs/>
+          <w:lang w:val="en-IN"/>
+        </w:rPr>
+        <w:t>Python 3.10+</w:t>
+      </w:r>
+      <w:r>
+        <w:rPr>
+          <w:lang w:val="en-IN"/>
+        </w:rPr>
+        <w:t xml:space="preserve"> – Core development language</w:t>
+      </w:r>
+    </w:p>
+    <w:p>
+      <w:pPr>
+        <w:rPr>
+          <w:lang w:val="en-IN"/>
+        </w:rPr>
+      </w:pPr>
+    </w:p>
+    <w:p>
+      <w:pPr>
+        <w:rPr>
+          <w:lang w:val="en-IN"/>
+        </w:rPr>
+      </w:pPr>
+      <w:r>
+        <w:rPr>
+          <w:rFonts w:ascii="Segoe UI Emoji" w:hAnsi="Segoe UI Emoji" w:cs="Segoe UI Emoji"/>
+          <w:b/>
+          <w:bCs/>
+          <w:lang w:val="en-IN"/>
+        </w:rPr>
+        <w:lastRenderedPageBreak/>
+        <w:t>🔹</w:t>
+      </w:r>
+      <w:r>
+        <w:rPr>
+          <w:b/>
+          <w:bCs/>
+          <w:lang w:val="en-IN"/>
+        </w:rPr>
+        <w:t xml:space="preserve"> AI &amp; Workflow Libraries</w:t>
+      </w:r>
+    </w:p>
+    <w:p>
+      <w:pPr>
+        <w:numPr>
+          <w:ilvl w:val="0"/>
+          <w:numId w:val="52"/>
+        </w:numPr>
+        <w:rPr>
+          <w:lang w:val="en-IN"/>
+        </w:rPr>
+      </w:pPr>
+      <w:r>
+        <w:rPr>
+          <w:b/>
+          <w:bCs/>
+          <w:lang w:val="en-IN"/>
+        </w:rPr>
+        <w:t>LangChain</w:t>
+      </w:r>
+      <w:r>
+        <w:rPr>
+          <w:lang w:val="en-IN"/>
+        </w:rPr>
+        <w:t xml:space="preserve"> – For intelligent tool execution</w:t>
+      </w:r>
+    </w:p>
+    <w:p>
+      <w:pPr>
+        <w:numPr>
+          <w:ilvl w:val="0"/>
+          <w:numId w:val="52"/>
+        </w:numPr>
+        <w:rPr>
+          <w:lang w:val="en-IN"/>
+        </w:rPr>
+      </w:pPr>
+      <w:r>
+        <w:rPr>
+          <w:b/>
+          <w:bCs/>
+          <w:lang w:val="en-IN"/>
+        </w:rPr>
+        <w:t>Pydantic</w:t>
+      </w:r>
+      <w:r>
+        <w:rPr>
+          <w:lang w:val="en-IN"/>
+        </w:rPr>
+        <w:t xml:space="preserve"> – For validating workflow schemas</w:t>
+      </w:r>
+    </w:p>
+    <w:p>
+      <w:pPr>
+        <w:rPr>
+          <w:lang w:val="en-IN"/>
+        </w:rPr>
+      </w:pPr>
+    </w:p>
+    <w:p>
+      <w:pPr>
+        <w:rPr>
+          <w:lang w:val="en-IN"/>
+        </w:rPr>
+      </w:pPr>
+      <w:r>
+        <w:rPr>
+          <w:rFonts w:ascii="Segoe UI Emoji" w:hAnsi="Segoe UI Emoji" w:cs="Segoe UI Emoji"/>
+          <w:b/>
+          <w:bCs/>
+          <w:lang w:val="en-IN"/>
+        </w:rPr>
+        <w:t>🔹</w:t>
+      </w:r>
+      <w:r>
+        <w:rPr>
+          <w:b/>
+          <w:bCs/>
+          <w:lang w:val="en-IN"/>
+        </w:rPr>
+        <w:t xml:space="preserve"> Tools &amp; Features</w:t>
+      </w:r>
+    </w:p>
+    <w:p>
+      <w:pPr>
+        <w:numPr>
+          <w:ilvl w:val="0"/>
+          <w:numId w:val="53"/>
+        </w:numPr>
+        <w:rPr>
+          <w:lang w:val="en-IN"/>
+        </w:rPr>
+      </w:pPr>
+      <w:r>
+        <w:rPr>
+          <w:b/>
+          <w:bCs/>
+          <w:lang w:val="en-IN"/>
+        </w:rPr>
+        <w:t>Email (SMTP)</w:t>
+      </w:r>
+      <w:r>
+        <w:rPr>
+          <w:lang w:val="en-IN"/>
+        </w:rPr>
+        <w:t xml:space="preserve"> – Multi-recipient email via Gmail</w:t>
+      </w:r>
+    </w:p>
+    <w:p>
+      <w:pPr>
+        <w:numPr>
+          <w:ilvl w:val="0"/>
+          <w:numId w:val="53"/>
+        </w:numPr>
+        <w:rPr>
+          <w:lang w:val="en-IN"/>
+        </w:rPr>
+      </w:pPr>
+      <w:r>
+        <w:rPr>
+          <w:b/>
+          <w:bCs/>
+          <w:lang w:val="en-IN"/>
+        </w:rPr>
+        <w:t>Web Scraping</w:t>
+      </w:r>
+      <w:r>
+        <w:rPr>
+          <w:lang w:val="en-IN"/>
+        </w:rPr>
+        <w:t xml:space="preserve"> – URL content extraction</w:t>
+      </w:r>
+    </w:p>
+    <w:p>
+      <w:pPr>
+        <w:numPr>
+          <w:ilvl w:val="0"/>
+          <w:numId w:val="53"/>
+        </w:numPr>
+        <w:rPr>
+          <w:lang w:val="en-IN"/>
+        </w:rPr>
+      </w:pPr>
+      <w:r>
+        <w:rPr>
+          <w:b/>
+          <w:bCs/>
+          <w:lang w:val="en-IN"/>
+        </w:rPr>
+        <w:t>PDF Summarizer</w:t>
+      </w:r>
+      <w:r>
+        <w:rPr>
+          <w:lang w:val="en-IN"/>
+        </w:rPr>
+        <w:t xml:space="preserve"> – (Under development)</w:t>
+      </w:r>
+    </w:p>
+    <w:p>
+      <w:pPr>
+        <w:rPr>
+          <w:lang w:val="en-IN"/>
+        </w:rPr>
+      </w:pPr>
+    </w:p>
+    <w:p>
+      <w:pPr>
+        <w:rPr>
+          <w:lang w:val="en-IN"/>
+        </w:rPr>
+      </w:pPr>
+      <w:r>
+        <w:rPr>
+          <w:rFonts w:ascii="Segoe UI Emoji" w:hAnsi="Segoe UI Emoji" w:cs="Segoe UI Emoji"/>
+          <w:b/>
+          <w:bCs/>
+          <w:lang w:val="en-IN"/>
+        </w:rPr>
+        <w:t>🔹</w:t>
+      </w:r>
+      <w:r>
+        <w:rPr>
+          <w:b/>
+          <w:bCs/>
+          <w:lang w:val="en-IN"/>
+        </w:rPr>
+        <w:t xml:space="preserve"> Dev &amp; Runtime</w:t>
+      </w:r>
+    </w:p>
+    <w:p>
+      <w:pPr>
+        <w:numPr>
+          <w:ilvl w:val="0"/>
+          <w:numId w:val="54"/>
+        </w:numPr>
+        <w:rPr>
+          <w:lang w:val="en-IN"/>
+        </w:rPr>
+      </w:pPr>
+      <w:proofErr w:type="spellStart"/>
+      <w:r>
+        <w:rPr>
+          <w:b/>
+          <w:bCs/>
+          <w:lang w:val="en-IN"/>
+        </w:rPr>
+        <w:t>Uvicorn</w:t>
+      </w:r>
+      <w:proofErr w:type="spellEnd"/>
+      <w:r>
+        <w:rPr>
+          <w:lang w:val="en-IN"/>
+        </w:rPr>
+        <w:t xml:space="preserve"> – FastAPI server runner</w:t>
+      </w:r>
+    </w:p>
+    <w:p>
+      <w:pPr>
+        <w:numPr>
+          <w:ilvl w:val="0"/>
+          <w:numId w:val="54"/>
+        </w:numPr>
+        <w:rPr>
+          <w:lang w:val="en-IN"/>
+        </w:rPr>
+      </w:pPr>
+      <w:proofErr w:type="spellStart"/>
+      <w:r>
+        <w:rPr>
+          <w:b/>
+          <w:bCs/>
+          <w:lang w:val="en-IN"/>
+        </w:rPr>
+        <w:t>dotenv</w:t>
+      </w:r>
+      <w:proofErr w:type="spellEnd"/>
+      <w:r>
+        <w:rPr>
+          <w:lang w:val="en-IN"/>
+        </w:rPr>
+        <w:t xml:space="preserve"> – Load credentials securely</w:t>
+      </w:r>
+    </w:p>
+    <w:p>
+      <w:pPr>
+        <w:numPr>
+          <w:ilvl w:val="0"/>
+          <w:numId w:val="54"/>
+        </w:numPr>
+        <w:rPr>
+          <w:lang w:val="en-IN"/>
+        </w:rPr>
+      </w:pPr>
+      <w:r>
+        <w:rPr>
+          <w:b/>
+          <w:bCs/>
+          <w:lang w:val="en-IN"/>
+        </w:rPr>
+        <w:t>Conda / pip</w:t>
+      </w:r>
+      <w:r>
+        <w:rPr>
+          <w:lang w:val="en-IN"/>
+        </w:rPr>
+        <w:t xml:space="preserve"> – Dependency management</w:t>
+      </w:r>
+    </w:p>
+    <w:p>
+      <w:pPr>
+        <w:rPr>
           <w:sz w:val="44"/>
           <w:szCs w:val="44"/>
           <w:lang w:val="en-IN"/>
         </w:rPr>
       </w:pPr>
       <w:r>
+        <w:rPr>
+          <w:sz w:val="44"/>
+          <w:szCs w:val="44"/>
+          <w:lang w:val="en-IN"/>
+        </w:rPr>
+        <w:t>P</w:t>
+      </w:r>
+      <w:r>
+        <w:rPr>
+          <w:sz w:val="44"/>
+          <w:szCs w:val="44"/>
+          <w:lang w:val="en-IN"/>
+        </w:rPr>
+        <w:t>rompt</w:t>
+      </w:r>
+      <w:r>
+        <w:rPr>
+          <w:sz w:val="44"/>
+          <w:szCs w:val="44"/>
+          <w:lang w:val="en-IN"/>
+        </w:rPr>
+        <w:t xml:space="preserve"> </w:t>
+      </w:r>
+      <w:r>
+        <w:rPr>
+          <w:sz w:val="44"/>
+          <w:szCs w:val="44"/>
+          <w:lang w:val="en-IN"/>
+        </w:rPr>
+        <w:t>forge/</w:t>
+      </w:r>
+      <w:r>
+        <w:rPr>
+          <w:sz w:val="44"/>
+          <w:szCs w:val="44"/>
+          <w:lang w:val="en-IN"/>
+        </w:rPr>
+        <w:t>folder structure</w:t>
+      </w:r>
+    </w:p>
+    <w:p>
+      <w:pPr>
+        <w:rPr>
+          <w:lang w:val="en-IN"/>
+        </w:rPr>
+      </w:pPr>
+      <w:r>
+        <w:rPr>
+          <w:rFonts w:ascii="Arial" w:hAnsi="Arial" w:cs="Arial"/>
+          <w:lang w:val="en-IN"/>
+        </w:rPr>
+        <w:t>├</w:t>
+      </w:r>
+      <w:r>
+        <w:rPr>
+          <w:rFonts w:ascii="Calibri" w:hAnsi="Calibri" w:cs="Calibri"/>
+          <w:lang w:val="en-IN"/>
+        </w:rPr>
+        <w:t>──</w:t>
+      </w:r>
+      <w:r>
+        <w:rPr>
+          <w:lang w:val="en-IN"/>
+        </w:rPr>
+        <w:t xml:space="preserve"> main.py              </w:t>
+      </w:r>
+      <w:r>
+        <w:rPr>
+          <w:lang w:val="en-IN"/>
+        </w:rPr>
+        <w:t xml:space="preserve">           </w:t>
+      </w:r>
+      <w:r>
+        <w:rPr>
+          <w:lang w:val="en-IN"/>
+        </w:rPr>
+        <w:t xml:space="preserve">  # Workflow runner (CLI + API)</w:t>
+      </w:r>
+    </w:p>
+    <w:p>
+      <w:pPr>
+        <w:rPr>
+          <w:lang w:val="en-IN"/>
+        </w:rPr>
+      </w:pPr>
+      <w:r>
+        <w:rPr>
+          <w:rFonts w:ascii="Arial" w:hAnsi="Arial" w:cs="Arial"/>
+          <w:lang w:val="en-IN"/>
+        </w:rPr>
+        <w:t>├</w:t>
+      </w:r>
+      <w:r>
+        <w:rPr>
+          <w:rFonts w:ascii="Calibri" w:hAnsi="Calibri" w:cs="Calibri"/>
+          <w:lang w:val="en-IN"/>
+        </w:rPr>
+        <w:t>──</w:t>
+      </w:r>
+      <w:r>
+        <w:rPr>
+          <w:lang w:val="en-IN"/>
+        </w:rPr>
+        <w:t xml:space="preserve"> config.py           </w:t>
+      </w:r>
+      <w:r>
+        <w:rPr>
+          <w:lang w:val="en-IN"/>
+        </w:rPr>
+        <w:t xml:space="preserve">          </w:t>
+      </w:r>
+      <w:r>
+        <w:rPr>
+          <w:lang w:val="en-IN"/>
+        </w:rPr>
+        <w:t xml:space="preserve">   # Loads env config</w:t>
+      </w:r>
+    </w:p>
+    <w:p>
+      <w:pPr>
+        <w:rPr>
+          <w:lang w:val="en-IN"/>
+        </w:rPr>
+      </w:pPr>
+      <w:r>
+        <w:rPr>
+          <w:rFonts w:ascii="Arial" w:hAnsi="Arial" w:cs="Arial"/>
+          <w:lang w:val="en-IN"/>
+        </w:rPr>
+        <w:t>├</w:t>
+      </w:r>
+      <w:r>
+        <w:rPr>
+          <w:rFonts w:ascii="Calibri" w:hAnsi="Calibri" w:cs="Calibri"/>
+          <w:lang w:val="en-IN"/>
+        </w:rPr>
+        <w:t>──</w:t>
+      </w:r>
+      <w:r>
+        <w:rPr>
+          <w:lang w:val="en-IN"/>
+        </w:rPr>
+        <w:t xml:space="preserve"> requirements.txt    </w:t>
+      </w:r>
+      <w:r>
+        <w:rPr>
+          <w:lang w:val="en-IN"/>
+        </w:rPr>
+        <w:t xml:space="preserve"> </w:t>
+      </w:r>
+      <w:r>
+        <w:rPr>
+          <w:lang w:val="en-IN"/>
+        </w:rPr>
+        <w:t xml:space="preserve">   # Dependencies</w:t>
+      </w:r>
+    </w:p>
+    <w:p>
+      <w:pPr>
+        <w:rPr>
+          <w:lang w:val="en-IN"/>
+        </w:rPr>
+      </w:pPr>
+      <w:r>
+        <w:rPr>
+          <w:rFonts w:ascii="Arial" w:hAnsi="Arial" w:cs="Arial"/>
+          <w:lang w:val="en-IN"/>
+        </w:rPr>
+        <w:t>├</w:t>
+      </w:r>
+      <w:r>
+        <w:rPr>
+          <w:rFonts w:ascii="Calibri" w:hAnsi="Calibri" w:cs="Calibri"/>
+          <w:lang w:val="en-IN"/>
+        </w:rPr>
+        <w:t>─</w:t>
+      </w:r>
+      <w:proofErr w:type="gramStart"/>
+      <w:r>
+        <w:rPr>
+          <w:rFonts w:ascii="Calibri" w:hAnsi="Calibri" w:cs="Calibri"/>
+          <w:lang w:val="en-IN"/>
+        </w:rPr>
+        <w:t>─</w:t>
+      </w:r>
+      <w:r>
+        <w:rPr>
+          <w:lang w:val="en-IN"/>
+        </w:rPr>
+        <w:t xml:space="preserve"> .env</w:t>
+      </w:r>
+      <w:proofErr w:type="gramEnd"/>
+      <w:r>
+        <w:rPr>
+          <w:lang w:val="en-IN"/>
+        </w:rPr>
+        <w:t xml:space="preserve">                   </w:t>
+      </w:r>
+      <w:r>
+        <w:rPr>
+          <w:lang w:val="en-IN"/>
+        </w:rPr>
+        <w:t xml:space="preserve">           </w:t>
+      </w:r>
+      <w:r>
+        <w:rPr>
+          <w:lang w:val="en-IN"/>
+        </w:rPr>
+        <w:t># Gmail SMTP credentials</w:t>
+      </w:r>
+    </w:p>
+    <w:p>
+      <w:pPr>
+        <w:rPr>
+          <w:lang w:val="en-IN"/>
+        </w:rPr>
+      </w:pPr>
+      <w:r>
+        <w:rPr>
+          <w:rFonts w:ascii="Arial" w:hAnsi="Arial" w:cs="Arial"/>
+          <w:lang w:val="en-IN"/>
+        </w:rPr>
+        <w:t>├</w:t>
+      </w:r>
+      <w:r>
+        <w:rPr>
+          <w:rFonts w:ascii="Calibri" w:hAnsi="Calibri" w:cs="Calibri"/>
+          <w:lang w:val="en-IN"/>
+        </w:rPr>
+        <w:t>──</w:t>
+      </w:r>
+      <w:r>
+        <w:rPr>
+          <w:lang w:val="en-IN"/>
+        </w:rPr>
+        <w:t xml:space="preserve"> README.md              # Project documentation</w:t>
+      </w:r>
+    </w:p>
+    <w:p>
+      <w:pPr>
+        <w:rPr>
+          <w:lang w:val="en-IN"/>
+        </w:rPr>
+      </w:pPr>
+    </w:p>
+    <w:p>
+      <w:pPr>
+        <w:rPr>
+          <w:lang w:val="en-IN"/>
+        </w:rPr>
+      </w:pPr>
+      <w:r>
+        <w:rPr>
+          <w:rFonts w:ascii="Arial" w:hAnsi="Arial" w:cs="Arial"/>
+          <w:lang w:val="en-IN"/>
+        </w:rPr>
+        <w:t>├</w:t>
+      </w:r>
+      <w:r>
+        <w:rPr>
+          <w:rFonts w:ascii="Calibri" w:hAnsi="Calibri" w:cs="Calibri"/>
+          <w:lang w:val="en-IN"/>
+        </w:rPr>
+        <w:t>──</w:t>
+      </w:r>
+      <w:r>
+        <w:rPr>
+          <w:lang w:val="en-IN"/>
+        </w:rPr>
+        <w:t xml:space="preserve"> agents/</w:t>
+      </w:r>
+    </w:p>
+    <w:p>
+      <w:pPr>
+        <w:rPr>
+          <w:lang w:val="en-IN"/>
+        </w:rPr>
+      </w:pPr>
+      <w:r>
+        <w:rPr>
+          <w:lang w:val="en-IN"/>
+        </w:rPr>
+        <w:t>│   └── executor.py        # Executes the workflow steps</w:t>
+      </w:r>
+    </w:p>
+    <w:p>
+      <w:pPr>
+        <w:rPr>
+          <w:lang w:val="en-IN"/>
+        </w:rPr>
+      </w:pPr>
+    </w:p>
+    <w:p>
+      <w:pPr>
+        <w:rPr>
+          <w:lang w:val="en-IN"/>
+        </w:rPr>
+      </w:pPr>
+      <w:r>
+        <w:rPr>
+          <w:rFonts w:ascii="Arial" w:hAnsi="Arial" w:cs="Arial"/>
+          <w:lang w:val="en-IN"/>
+        </w:rPr>
+        <w:t>├</w:t>
+      </w:r>
+      <w:r>
+        <w:rPr>
+          <w:rFonts w:ascii="Calibri" w:hAnsi="Calibri" w:cs="Calibri"/>
+          <w:lang w:val="en-IN"/>
+        </w:rPr>
+        <w:t>──</w:t>
+      </w:r>
+      <w:r>
+        <w:rPr>
+          <w:lang w:val="en-IN"/>
+        </w:rPr>
+        <w:t xml:space="preserve"> memory/</w:t>
+      </w:r>
+    </w:p>
+    <w:p>
+      <w:pPr>
+        <w:rPr>
+          <w:lang w:val="en-IN"/>
+        </w:rPr>
+      </w:pPr>
+      <w:r>
+        <w:rPr>
+          <w:lang w:val="en-IN"/>
+        </w:rPr>
+        <w:t xml:space="preserve">│   └── local_memory.py    </w:t>
+      </w:r>
+      <w:r>
+        <w:rPr>
+          <w:lang w:val="en-IN"/>
+        </w:rPr>
+        <w:t xml:space="preserve">   </w:t>
+      </w:r>
+      <w:r>
+        <w:rPr>
+          <w:lang w:val="en-IN"/>
+        </w:rPr>
+        <w:t># Stores step results locally</w:t>
+      </w:r>
+    </w:p>
+    <w:p>
+      <w:pPr>
+        <w:rPr>
+          <w:lang w:val="en-IN"/>
+        </w:rPr>
+      </w:pPr>
+    </w:p>
+    <w:p>
+      <w:pPr>
+        <w:rPr>
+          <w:lang w:val="en-IN"/>
+        </w:rPr>
+      </w:pPr>
+      <w:r>
+        <w:rPr>
+          <w:rFonts w:ascii="Arial" w:hAnsi="Arial" w:cs="Arial"/>
+          <w:lang w:val="en-IN"/>
+        </w:rPr>
+        <w:t>├</w:t>
+      </w:r>
+      <w:r>
+        <w:rPr>
+          <w:rFonts w:ascii="Calibri" w:hAnsi="Calibri" w:cs="Calibri"/>
+          <w:lang w:val="en-IN"/>
+        </w:rPr>
+        <w:t>──</w:t>
+      </w:r>
+      <w:r>
+        <w:rPr>
+          <w:lang w:val="en-IN"/>
+        </w:rPr>
+        <w:t xml:space="preserve"> schemas/</w:t>
+      </w:r>
+    </w:p>
+    <w:p>
+      <w:pPr>
+        <w:rPr>
+          <w:lang w:val="en-IN"/>
+        </w:rPr>
+      </w:pPr>
+      <w:r>
+        <w:rPr>
+          <w:lang w:val="en-IN"/>
+        </w:rPr>
+        <w:t xml:space="preserve">│   └── workflow_schema.py </w:t>
+      </w:r>
+      <w:r>
+        <w:rPr>
+          <w:lang w:val="en-IN"/>
+        </w:rPr>
+        <w:t xml:space="preserve">   </w:t>
+      </w:r>
+      <w:r>
+        <w:rPr>
+          <w:lang w:val="en-IN"/>
+        </w:rPr>
+        <w:t># JSON schema validator</w:t>
+      </w:r>
+    </w:p>
+    <w:p>
+      <w:pPr>
+        <w:rPr>
+          <w:lang w:val="en-IN"/>
+        </w:rPr>
+      </w:pPr>
+    </w:p>
+    <w:p>
+      <w:pPr>
+        <w:rPr>
+          <w:lang w:val="en-IN"/>
+        </w:rPr>
+      </w:pPr>
+      <w:r>
+        <w:rPr>
+          <w:rFonts w:ascii="Arial" w:hAnsi="Arial" w:cs="Arial"/>
+          <w:lang w:val="en-IN"/>
+        </w:rPr>
+        <w:t>├</w:t>
+      </w:r>
+      <w:r>
+        <w:rPr>
+          <w:rFonts w:ascii="Calibri" w:hAnsi="Calibri" w:cs="Calibri"/>
+          <w:lang w:val="en-IN"/>
+        </w:rPr>
+        <w:t>──</w:t>
+      </w:r>
+      <w:r>
+        <w:rPr>
+          <w:lang w:val="en-IN"/>
+        </w:rPr>
+        <w:t xml:space="preserve"> tools/</w:t>
+      </w:r>
+    </w:p>
+    <w:p>
+      <w:pPr>
+        <w:rPr>
+          <w:lang w:val="en-IN"/>
+        </w:rPr>
+      </w:pPr>
+      <w:r>
+        <w:rPr>
+          <w:lang w:val="en-IN"/>
+        </w:rPr>
+        <w:t xml:space="preserve">│   </w:t>
+      </w:r>
+      <w:r>
+        <w:rPr>
+          <w:rFonts w:ascii="Arial" w:hAnsi="Arial" w:cs="Arial"/>
+          <w:lang w:val="en-IN"/>
+        </w:rPr>
+        <w:t>├</w:t>
+      </w:r>
+      <w:r>
+        <w:rPr>
+          <w:rFonts w:ascii="Calibri" w:hAnsi="Calibri" w:cs="Calibri"/>
+          <w:lang w:val="en-IN"/>
+        </w:rPr>
+        <w:t>──</w:t>
+      </w:r>
+      <w:r>
+        <w:rPr>
+          <w:lang w:val="en-IN"/>
+        </w:rPr>
+        <w:t xml:space="preserve"> email_sender.py    </w:t>
+      </w:r>
+      <w:r>
+        <w:rPr>
+          <w:lang w:val="en-IN"/>
+        </w:rPr>
+        <w:t xml:space="preserve">    </w:t>
+      </w:r>
+      <w:r>
+        <w:rPr>
+          <w:lang w:val="en-IN"/>
+        </w:rPr>
+        <w:t># Sends email with attachments</w:t>
+      </w:r>
+    </w:p>
+    <w:p>
+      <w:pPr>
+        <w:rPr>
+          <w:lang w:val="en-IN"/>
+        </w:rPr>
+      </w:pPr>
+      <w:r>
+        <w:rPr>
+          <w:lang w:val="en-IN"/>
+        </w:rPr>
+        <w:t xml:space="preserve">│   </w:t>
+      </w:r>
+      <w:r>
+        <w:rPr>
+          <w:rFonts w:ascii="Arial" w:hAnsi="Arial" w:cs="Arial"/>
+          <w:lang w:val="en-IN"/>
+        </w:rPr>
+        <w:t>├</w:t>
+      </w:r>
+      <w:r>
+        <w:rPr>
+          <w:rFonts w:ascii="Calibri" w:hAnsi="Calibri" w:cs="Calibri"/>
+          <w:lang w:val="en-IN"/>
+        </w:rPr>
+        <w:t>──</w:t>
+      </w:r>
+      <w:r>
+        <w:rPr>
+          <w:lang w:val="en-IN"/>
+        </w:rPr>
+        <w:t xml:space="preserve"> pdf_summarizer.py </w:t>
+      </w:r>
+      <w:r>
+        <w:rPr>
+          <w:lang w:val="en-IN"/>
+        </w:rPr>
+        <w:t xml:space="preserve">   </w:t>
+      </w:r>
+      <w:r>
+        <w:rPr>
+          <w:lang w:val="en-IN"/>
+        </w:rPr>
+        <w:t xml:space="preserve"> # Summarizes PDFs (in progress)</w:t>
+      </w:r>
+    </w:p>
+    <w:p>
+      <w:pPr>
+        <w:rPr>
+          <w:lang w:val="en-IN"/>
+        </w:rPr>
+      </w:pPr>
+      <w:r>
+        <w:rPr>
+          <w:lang w:val="en-IN"/>
+        </w:rPr>
+        <w:t xml:space="preserve">│   └── web_scraper.py     </w:t>
+      </w:r>
+      <w:r>
+        <w:rPr>
+          <w:lang w:val="en-IN"/>
+        </w:rPr>
+        <w:t xml:space="preserve">    </w:t>
+      </w:r>
+      <w:r>
+        <w:rPr>
+          <w:lang w:val="en-IN"/>
+        </w:rPr>
+        <w:t># Extracts content from URLs</w:t>
+      </w:r>
+    </w:p>
+    <w:p>
+      <w:pPr>
+        <w:rPr>
+          <w:lang w:val="en-IN"/>
+        </w:rPr>
+      </w:pPr>
+    </w:p>
+    <w:p>
+      <w:pPr>
+        <w:rPr>
+          <w:lang w:val="en-IN"/>
+        </w:rPr>
+      </w:pPr>
+      <w:r>
+        <w:rPr>
+          <w:rFonts w:ascii="Arial" w:hAnsi="Arial" w:cs="Arial"/>
+          <w:lang w:val="en-IN"/>
+        </w:rPr>
+        <w:t>├</w:t>
+      </w:r>
+      <w:r>
+        <w:rPr>
+          <w:rFonts w:ascii="Calibri" w:hAnsi="Calibri" w:cs="Calibri"/>
+          <w:lang w:val="en-IN"/>
+        </w:rPr>
+        <w:t>──</w:t>
+      </w:r>
+      <w:r>
+        <w:rPr>
+          <w:lang w:val="en-IN"/>
+        </w:rPr>
+        <w:t xml:space="preserve"> utils/</w:t>
+      </w:r>
+    </w:p>
+    <w:p>
+      <w:pPr>
+        <w:rPr>
+          <w:lang w:val="en-IN"/>
+        </w:rPr>
+      </w:pPr>
+      <w:r>
+        <w:rPr>
+          <w:lang w:val="en-IN"/>
+        </w:rPr>
+        <w:t>│   └── logger.py          # Logging utilities</w:t>
+      </w:r>
+    </w:p>
+    <w:p>
+      <w:pPr>
+        <w:rPr>
+          <w:lang w:val="en-IN"/>
+        </w:rPr>
+      </w:pPr>
+    </w:p>
+    <w:p>
+      <w:pPr>
+        <w:rPr>
+          <w:lang w:val="en-IN"/>
+        </w:rPr>
+      </w:pPr>
+      <w:r>
+        <w:rPr>
+          <w:rFonts w:ascii="Arial" w:hAnsi="Arial" w:cs="Arial"/>
+          <w:lang w:val="en-IN"/>
+        </w:rPr>
+        <w:t>├</w:t>
+      </w:r>
+      <w:r>
+        <w:rPr>
+          <w:rFonts w:ascii="Calibri" w:hAnsi="Calibri" w:cs="Calibri"/>
+          <w:lang w:val="en-IN"/>
+        </w:rPr>
+        <w:t>──</w:t>
+      </w:r>
+      <w:r>
+        <w:rPr>
+          <w:lang w:val="en-IN"/>
+        </w:rPr>
+        <w:t xml:space="preserve"> workflows/</w:t>
+      </w:r>
+    </w:p>
+    <w:p>
+      <w:pPr>
+        <w:rPr>
+          <w:lang w:val="en-IN"/>
+        </w:rPr>
+      </w:pPr>
+      <w:r>
+        <w:rPr>
+          <w:lang w:val="en-IN"/>
+        </w:rPr>
+        <w:t>│   └── example_</w:t>
+      </w:r>
+      <w:proofErr w:type="gramStart"/>
+      <w:r>
+        <w:rPr>
+          <w:lang w:val="en-IN"/>
+        </w:rPr>
+        <w:t>workflow.json</w:t>
+      </w:r>
+      <w:proofErr w:type="gramEnd"/>
+      <w:r>
+        <w:rPr>
+          <w:lang w:val="en-IN"/>
+        </w:rPr>
+        <w:t xml:space="preserve">  </w:t>
+      </w:r>
+      <w:r>
+        <w:rPr>
+          <w:lang w:val="en-IN"/>
+        </w:rPr>
+        <w:t xml:space="preserve">   </w:t>
+      </w:r>
+      <w:r>
+        <w:rPr>
+          <w:lang w:val="en-IN"/>
+        </w:rPr>
+        <w:t># JSON-defined workflow</w:t>
+      </w:r>
+    </w:p>
+    <w:p>
+      <w:pPr>
+        <w:rPr>
+          <w:lang w:val="en-IN"/>
+        </w:rPr>
+      </w:pPr>
+    </w:p>
+    <w:p>
+      <w:pPr>
         <w:rPr>
           <w:b/>
           <w:bCs/>
@@ -859,34 +2533,29 @@
           <w:szCs w:val="44"/>
           <w:lang w:val="en-IN"/>
         </w:rPr>
-        <w:t>Current Status &amp; Future Development</w:t>
-      </w:r>
-    </w:p>
-    <w:p>
-      <w:pPr>
-        <w:rPr>
-          <w:lang w:val="en-IN"/>
-        </w:rPr>
-      </w:pPr>
-      <w:r>
-        <w:rPr>
-          <w:lang w:val="en-IN"/>
-        </w:rPr>
-        <w:t xml:space="preserve">At present, the </w:t>
-      </w:r>
+      </w:pPr>
       <w:r>
         <w:rPr>
           <w:b/>
           <w:bCs/>
-          <w:lang w:val="en-IN"/>
-        </w:rPr>
-        <w:t>email module is fully functional</w:t>
-      </w:r>
-      <w:r>
-        <w:rPr>
-          <w:lang w:val="en-IN"/>
-        </w:rPr>
-        <w:t xml:space="preserve">. It successfully sends AI-generated content via Gmail SMTP to </w:t>
+          <w:sz w:val="44"/>
+          <w:szCs w:val="44"/>
+          <w:lang w:val="en-IN"/>
+        </w:rPr>
+        <w:t>Current Status &amp; Future Development</w:t>
+      </w:r>
+    </w:p>
+    <w:p>
+      <w:pPr>
+        <w:rPr>
+          <w:lang w:val="en-IN"/>
+        </w:rPr>
+      </w:pPr>
+      <w:r>
+        <w:rPr>
+          <w:lang w:val="en-IN"/>
+        </w:rPr>
+        <w:t xml:space="preserve">At present, the </w:t>
       </w:r>
       <w:r>
         <w:rPr>
@@ -894,13 +2563,13 @@
           <w:bCs/>
           <w:lang w:val="en-IN"/>
         </w:rPr>
-        <w:t>multiple recipients</w:t>
-      </w:r>
-      <w:r>
-        <w:rPr>
-          <w:lang w:val="en-IN"/>
-        </w:rPr>
-        <w:t xml:space="preserve">, and can dynamically compose emails using content extracted from </w:t>
+        <w:t>email module is fully functional</w:t>
+      </w:r>
+      <w:r>
+        <w:rPr>
+          <w:lang w:val="en-IN"/>
+        </w:rPr>
+        <w:t xml:space="preserve">. It successfully sends AI-generated content via Gmail SMTP to </w:t>
       </w:r>
       <w:r>
         <w:rPr>
@@ -908,6 +2577,20 @@
           <w:bCs/>
           <w:lang w:val="en-IN"/>
         </w:rPr>
+        <w:t>multiple recipients</w:t>
+      </w:r>
+      <w:r>
+        <w:rPr>
+          <w:lang w:val="en-IN"/>
+        </w:rPr>
+        <w:t xml:space="preserve">, and can dynamically compose emails using content extracted from </w:t>
+      </w:r>
+      <w:r>
+        <w:rPr>
+          <w:b/>
+          <w:bCs/>
+          <w:lang w:val="en-IN"/>
+        </w:rPr>
         <w:t>URLs</w:t>
       </w:r>
       <w:r>
@@ -927,6 +2610,7 @@
         <w:rPr>
           <w:lang w:val="en-IN"/>
         </w:rPr>
+        <w:lastRenderedPageBreak/>
         <w:t xml:space="preserve">The </w:t>
       </w:r>
       <w:r>
@@ -1136,7 +2820,6 @@
         <w:rPr>
           <w:lang w:val="en-IN"/>
         </w:rPr>
-        <w:lastRenderedPageBreak/>
         <w:t>Create a SaaS platform for multi-user workflow creation and sharing</w:t>
       </w:r>
     </w:p>
@@ -1348,6 +3031,155 @@
 <file path=word/numbering.xml><?xml version="1.0" encoding="utf-8"?>
 <w:numbering xmlns:wpc="http://schemas.microsoft.com/office/word/2010/wordprocessingCanvas" xmlns:cx="http://schemas.microsoft.com/office/drawing/2014/chartex" xmlns:cx1="http://schemas.microsoft.com/office/drawing/2015/9/8/chartex" xmlns:cx2="http://schemas.microsoft.com/office/drawing/2015/10/21/chartex" xmlns:cx3="http://schemas.microsoft.com/office/drawing/2016/5/9/chartex" xmlns:cx4="http://schemas.microsoft.com/office/drawing/2016/5/10/chartex" xmlns:cx5="http://schemas.microsoft.com/office/drawing/2016/5/11/chartex" xmlns:cx6="http://schemas.microsoft.com/office/drawing/2016/5/12/chartex" xmlns:cx7="http://schemas.microsoft.com/office/drawing/2016/5/13/chartex" xmlns:cx8="http://schemas.microsoft.com/office/drawing/2016/5/14/chartex" xmlns:mc="http://schemas.openxmlformats.org/markup-compatibility/2006" xmlns:aink="http://schemas.microsoft.com/office/drawing/2016/ink" xmlns:am3d="http://schemas.microsoft.com/office/drawing/2017/model3d" xmlns:o="urn:schemas-microsoft-com:office:office" xmlns:oel="http://schemas.microsoft.com/office/2019/extlst" xmlns:r="http://schemas.openxmlformats.org/officeDocument/2006/relationships" xmlns:m="http://schemas.openxmlformats.org/officeDocument/2006/math" xmlns:v="urn:schemas-microsoft-com:vml" xmlns:wp14="http://schemas.microsoft.com/office/word/2010/wordprocessingDrawing" xmlns:wp="http://schemas.openxmlformats.org/drawingml/2006/wordprocessingDrawing" xmlns:w10="urn:schemas-microsoft-com:office:word" xmlns:w="http://schemas.openxmlformats.org/wordprocessingml/2006/main" xmlns:w14="http://schemas.microsoft.com/office/word/2010/wordml" xmlns:w15="http://schemas.microsoft.com/office/word/2012/wordml" xmlns:w16cex="http://schemas.microsoft.com/office/word/2018/wordml/cex" xmlns:w16cid="http://schemas.microsoft.com/office/word/2016/wordml/cid" xmlns:w16="http://schemas.microsoft.com/office/word/2018/wordml" xmlns:w16du="http://schemas.microsoft.com/office/word/2023/wordml/word16du" xmlns:w16sdtdh="http://schemas.microsoft.com/office/word/2020/wordml/sdtdatahash" xmlns:w16se="http://schemas.microsoft.com/office/word/2015/wordml/symex" xmlns:wpg="http://schemas.microsoft.com/office/word/2010/wordprocessingGroup" xmlns:wpi="http://schemas.microsoft.com/office/word/2010/wordprocessingInk" xmlns:wne="http://schemas.microsoft.com/office/word/2006/wordml" xmlns:wps="http://schemas.microsoft.com/office/word/2010/wordprocessingShape" mc:Ignorable="w14 w15 w16se w16cid w16 w16cex w16sdtdh w16du wp14">
   <w:abstractNum w:abstractNumId="0" w15:restartNumberingAfterBreak="0">
+    <w:nsid w:val="0027799A"/>
+    <w:multiLevelType w:val="multilevel"/>
+    <w:tmpl w:val="A61E4D58"/>
+    <w:lvl w:ilvl="0">
+      <w:start w:val="1"/>
+      <w:numFmt w:val="bullet"/>
+      <w:lvlText w:val=""/>
+      <w:lvlJc w:val="left"/>
+      <w:pPr>
+        <w:tabs>
+          <w:tab w:val="num" w:pos="720"/>
+        </w:tabs>
+        <w:ind w:left="720" w:hanging="360"/>
+      </w:pPr>
+      <w:rPr>
+        <w:rFonts w:ascii="Symbol" w:hAnsi="Symbol" w:hint="default"/>
+        <w:sz w:val="20"/>
+      </w:rPr>
+    </w:lvl>
+    <w:lvl w:ilvl="1" w:tentative="1">
+      <w:start w:val="1"/>
+      <w:numFmt w:val="bullet"/>
+      <w:lvlText w:val="o"/>
+      <w:lvlJc w:val="left"/>
+      <w:pPr>
+        <w:tabs>
+          <w:tab w:val="num" w:pos="1440"/>
+        </w:tabs>
+        <w:ind w:left="1440" w:hanging="360"/>
+      </w:pPr>
+      <w:rPr>
+        <w:rFonts w:ascii="Courier New" w:hAnsi="Courier New" w:hint="default"/>
+        <w:sz w:val="20"/>
+      </w:rPr>
+    </w:lvl>
+    <w:lvl w:ilvl="2" w:tentative="1">
+      <w:start w:val="1"/>
+      <w:numFmt w:val="bullet"/>
+      <w:lvlText w:val=""/>
+      <w:lvlJc w:val="left"/>
+      <w:pPr>
+        <w:tabs>
+          <w:tab w:val="num" w:pos="2160"/>
+        </w:tabs>
+        <w:ind w:left="2160" w:hanging="360"/>
+      </w:pPr>
+      <w:rPr>
+        <w:rFonts w:ascii="Wingdings" w:hAnsi="Wingdings" w:hint="default"/>
+        <w:sz w:val="20"/>
+      </w:rPr>
+    </w:lvl>
+    <w:lvl w:ilvl="3" w:tentative="1">
+      <w:start w:val="1"/>
+      <w:numFmt w:val="bullet"/>
+      <w:lvlText w:val=""/>
+      <w:lvlJc w:val="left"/>
+      <w:pPr>
+        <w:tabs>
+          <w:tab w:val="num" w:pos="2880"/>
+        </w:tabs>
+        <w:ind w:left="2880" w:hanging="360"/>
+      </w:pPr>
+      <w:rPr>
+        <w:rFonts w:ascii="Wingdings" w:hAnsi="Wingdings" w:hint="default"/>
+        <w:sz w:val="20"/>
+      </w:rPr>
+    </w:lvl>
+    <w:lvl w:ilvl="4" w:tentative="1">
+      <w:start w:val="1"/>
+      <w:numFmt w:val="bullet"/>
+      <w:lvlText w:val=""/>
+      <w:lvlJc w:val="left"/>
+      <w:pPr>
+        <w:tabs>
+          <w:tab w:val="num" w:pos="3600"/>
+        </w:tabs>
+        <w:ind w:left="3600" w:hanging="360"/>
+      </w:pPr>
+      <w:rPr>
+        <w:rFonts w:ascii="Wingdings" w:hAnsi="Wingdings" w:hint="default"/>
+        <w:sz w:val="20"/>
+      </w:rPr>
+    </w:lvl>
+    <w:lvl w:ilvl="5" w:tentative="1">
+      <w:start w:val="1"/>
+      <w:numFmt w:val="bullet"/>
+      <w:lvlText w:val=""/>
+      <w:lvlJc w:val="left"/>
+      <w:pPr>
+        <w:tabs>
+          <w:tab w:val="num" w:pos="4320"/>
+        </w:tabs>
+        <w:ind w:left="4320" w:hanging="360"/>
+      </w:pPr>
+      <w:rPr>
+        <w:rFonts w:ascii="Wingdings" w:hAnsi="Wingdings" w:hint="default"/>
+        <w:sz w:val="20"/>
+      </w:rPr>
+    </w:lvl>
+    <w:lvl w:ilvl="6" w:tentative="1">
+      <w:start w:val="1"/>
+      <w:numFmt w:val="bullet"/>
+      <w:lvlText w:val=""/>
+      <w:lvlJc w:val="left"/>
+      <w:pPr>
+        <w:tabs>
+          <w:tab w:val="num" w:pos="5040"/>
+        </w:tabs>
+        <w:ind w:left="5040" w:hanging="360"/>
+      </w:pPr>
+      <w:rPr>
+        <w:rFonts w:ascii="Wingdings" w:hAnsi="Wingdings" w:hint="default"/>
+        <w:sz w:val="20"/>
+      </w:rPr>
+    </w:lvl>
+    <w:lvl w:ilvl="7" w:tentative="1">
+      <w:start w:val="1"/>
+      <w:numFmt w:val="bullet"/>
+      <w:lvlText w:val=""/>
+      <w:lvlJc w:val="left"/>
+      <w:pPr>
+        <w:tabs>
+          <w:tab w:val="num" w:pos="5760"/>
+        </w:tabs>
+        <w:ind w:left="5760" w:hanging="360"/>
+      </w:pPr>
+      <w:rPr>
+        <w:rFonts w:ascii="Wingdings" w:hAnsi="Wingdings" w:hint="default"/>
+        <w:sz w:val="20"/>
+      </w:rPr>
+    </w:lvl>
+    <w:lvl w:ilvl="8" w:tentative="1">
+      <w:start w:val="1"/>
+      <w:numFmt w:val="bullet"/>
+      <w:lvlText w:val=""/>
+      <w:lvlJc w:val="left"/>
+      <w:pPr>
+        <w:tabs>
+          <w:tab w:val="num" w:pos="6480"/>
+        </w:tabs>
+        <w:ind w:left="6480" w:hanging="360"/>
+      </w:pPr>
+      <w:rPr>
+        <w:rFonts w:ascii="Wingdings" w:hAnsi="Wingdings" w:hint="default"/>
+        <w:sz w:val="20"/>
+      </w:rPr>
+    </w:lvl>
+  </w:abstractNum>
+  <w:abstractNum w:abstractNumId="1" w15:restartNumberingAfterBreak="0">
     <w:nsid w:val="053E3F38"/>
     <w:multiLevelType w:val="multilevel"/>
     <w:tmpl w:val="FAF2C062"/>
@@ -1496,7 +3328,7 @@
       </w:rPr>
     </w:lvl>
   </w:abstractNum>
-  <w:abstractNum w:abstractNumId="1" w15:restartNumberingAfterBreak="0">
+  <w:abstractNum w:abstractNumId="2" w15:restartNumberingAfterBreak="0">
     <w:nsid w:val="0A2C646B"/>
     <w:multiLevelType w:val="multilevel"/>
     <w:tmpl w:val="5FF48C94"/>
@@ -1645,7 +3477,7 @@
       </w:rPr>
     </w:lvl>
   </w:abstractNum>
-  <w:abstractNum w:abstractNumId="2" w15:restartNumberingAfterBreak="0">
+  <w:abstractNum w:abstractNumId="3" w15:restartNumberingAfterBreak="0">
     <w:nsid w:val="0B5B46EF"/>
     <w:multiLevelType w:val="multilevel"/>
     <w:tmpl w:val="06C4DF76"/>
@@ -1794,7 +3626,7 @@
       </w:rPr>
     </w:lvl>
   </w:abstractNum>
-  <w:abstractNum w:abstractNumId="3" w15:restartNumberingAfterBreak="0">
+  <w:abstractNum w:abstractNumId="4" w15:restartNumberingAfterBreak="0">
     <w:nsid w:val="0FE623CA"/>
     <w:multiLevelType w:val="multilevel"/>
     <w:tmpl w:val="6ED679E8"/>
@@ -1943,7 +3775,7 @@
       </w:rPr>
     </w:lvl>
   </w:abstractNum>
-  <w:abstractNum w:abstractNumId="4" w15:restartNumberingAfterBreak="0">
+  <w:abstractNum w:abstractNumId="5" w15:restartNumberingAfterBreak="0">
     <w:nsid w:val="106B0C9C"/>
     <w:multiLevelType w:val="multilevel"/>
     <w:tmpl w:val="F7D8D180"/>
@@ -2092,7 +3924,156 @@
       </w:rPr>
     </w:lvl>
   </w:abstractNum>
-  <w:abstractNum w:abstractNumId="5" w15:restartNumberingAfterBreak="0">
+  <w:abstractNum w:abstractNumId="6" w15:restartNumberingAfterBreak="0">
+    <w:nsid w:val="11D70668"/>
+    <w:multiLevelType w:val="multilevel"/>
+    <w:tmpl w:val="06507530"/>
+    <w:lvl w:ilvl="0">
+      <w:start w:val="1"/>
+      <w:numFmt w:val="bullet"/>
+      <w:lvlText w:val=""/>
+      <w:lvlJc w:val="left"/>
+      <w:pPr>
+        <w:tabs>
+          <w:tab w:val="num" w:pos="720"/>
+        </w:tabs>
+        <w:ind w:left="720" w:hanging="360"/>
+      </w:pPr>
+      <w:rPr>
+        <w:rFonts w:ascii="Symbol" w:hAnsi="Symbol" w:hint="default"/>
+        <w:sz w:val="20"/>
+      </w:rPr>
+    </w:lvl>
+    <w:lvl w:ilvl="1" w:tentative="1">
+      <w:start w:val="1"/>
+      <w:numFmt w:val="bullet"/>
+      <w:lvlText w:val="o"/>
+      <w:lvlJc w:val="left"/>
+      <w:pPr>
+        <w:tabs>
+          <w:tab w:val="num" w:pos="1440"/>
+        </w:tabs>
+        <w:ind w:left="1440" w:hanging="360"/>
+      </w:pPr>
+      <w:rPr>
+        <w:rFonts w:ascii="Courier New" w:hAnsi="Courier New" w:hint="default"/>
+        <w:sz w:val="20"/>
+      </w:rPr>
+    </w:lvl>
+    <w:lvl w:ilvl="2" w:tentative="1">
+      <w:start w:val="1"/>
+      <w:numFmt w:val="bullet"/>
+      <w:lvlText w:val=""/>
+      <w:lvlJc w:val="left"/>
+      <w:pPr>
+        <w:tabs>
+          <w:tab w:val="num" w:pos="2160"/>
+        </w:tabs>
+        <w:ind w:left="2160" w:hanging="360"/>
+      </w:pPr>
+      <w:rPr>
+        <w:rFonts w:ascii="Wingdings" w:hAnsi="Wingdings" w:hint="default"/>
+        <w:sz w:val="20"/>
+      </w:rPr>
+    </w:lvl>
+    <w:lvl w:ilvl="3" w:tentative="1">
+      <w:start w:val="1"/>
+      <w:numFmt w:val="bullet"/>
+      <w:lvlText w:val=""/>
+      <w:lvlJc w:val="left"/>
+      <w:pPr>
+        <w:tabs>
+          <w:tab w:val="num" w:pos="2880"/>
+        </w:tabs>
+        <w:ind w:left="2880" w:hanging="360"/>
+      </w:pPr>
+      <w:rPr>
+        <w:rFonts w:ascii="Wingdings" w:hAnsi="Wingdings" w:hint="default"/>
+        <w:sz w:val="20"/>
+      </w:rPr>
+    </w:lvl>
+    <w:lvl w:ilvl="4" w:tentative="1">
+      <w:start w:val="1"/>
+      <w:numFmt w:val="bullet"/>
+      <w:lvlText w:val=""/>
+      <w:lvlJc w:val="left"/>
+      <w:pPr>
+        <w:tabs>
+          <w:tab w:val="num" w:pos="3600"/>
+        </w:tabs>
+        <w:ind w:left="3600" w:hanging="360"/>
+      </w:pPr>
+      <w:rPr>
+        <w:rFonts w:ascii="Wingdings" w:hAnsi="Wingdings" w:hint="default"/>
+        <w:sz w:val="20"/>
+      </w:rPr>
+    </w:lvl>
+    <w:lvl w:ilvl="5" w:tentative="1">
+      <w:start w:val="1"/>
+      <w:numFmt w:val="bullet"/>
+      <w:lvlText w:val=""/>
+      <w:lvlJc w:val="left"/>
+      <w:pPr>
+        <w:tabs>
+          <w:tab w:val="num" w:pos="4320"/>
+        </w:tabs>
+        <w:ind w:left="4320" w:hanging="360"/>
+      </w:pPr>
+      <w:rPr>
+        <w:rFonts w:ascii="Wingdings" w:hAnsi="Wingdings" w:hint="default"/>
+        <w:sz w:val="20"/>
+      </w:rPr>
+    </w:lvl>
+    <w:lvl w:ilvl="6" w:tentative="1">
+      <w:start w:val="1"/>
+      <w:numFmt w:val="bullet"/>
+      <w:lvlText w:val=""/>
+      <w:lvlJc w:val="left"/>
+      <w:pPr>
+        <w:tabs>
+          <w:tab w:val="num" w:pos="5040"/>
+        </w:tabs>
+        <w:ind w:left="5040" w:hanging="360"/>
+      </w:pPr>
+      <w:rPr>
+        <w:rFonts w:ascii="Wingdings" w:hAnsi="Wingdings" w:hint="default"/>
+        <w:sz w:val="20"/>
+      </w:rPr>
+    </w:lvl>
+    <w:lvl w:ilvl="7" w:tentative="1">
+      <w:start w:val="1"/>
+      <w:numFmt w:val="bullet"/>
+      <w:lvlText w:val=""/>
+      <w:lvlJc w:val="left"/>
+      <w:pPr>
+        <w:tabs>
+          <w:tab w:val="num" w:pos="5760"/>
+        </w:tabs>
+        <w:ind w:left="5760" w:hanging="360"/>
+      </w:pPr>
+      <w:rPr>
+        <w:rFonts w:ascii="Wingdings" w:hAnsi="Wingdings" w:hint="default"/>
+        <w:sz w:val="20"/>
+      </w:rPr>
+    </w:lvl>
+    <w:lvl w:ilvl="8" w:tentative="1">
+      <w:start w:val="1"/>
+      <w:numFmt w:val="bullet"/>
+      <w:lvlText w:val=""/>
+      <w:lvlJc w:val="left"/>
+      <w:pPr>
+        <w:tabs>
+          <w:tab w:val="num" w:pos="6480"/>
+        </w:tabs>
+        <w:ind w:left="6480" w:hanging="360"/>
+      </w:pPr>
+      <w:rPr>
+        <w:rFonts w:ascii="Wingdings" w:hAnsi="Wingdings" w:hint="default"/>
+        <w:sz w:val="20"/>
+      </w:rPr>
+    </w:lvl>
+  </w:abstractNum>
+  <w:abstractNum w:abstractNumId="7" w15:restartNumberingAfterBreak="0">
     <w:nsid w:val="120D3CF6"/>
     <w:multiLevelType w:val="multilevel"/>
     <w:tmpl w:val="BE08F0B4"/>
@@ -2241,7 +4222,7 @@
       </w:rPr>
     </w:lvl>
   </w:abstractNum>
-  <w:abstractNum w:abstractNumId="6" w15:restartNumberingAfterBreak="0">
+  <w:abstractNum w:abstractNumId="8" w15:restartNumberingAfterBreak="0">
     <w:nsid w:val="13320954"/>
     <w:multiLevelType w:val="multilevel"/>
     <w:tmpl w:val="094ACA2A"/>
@@ -2390,7 +4371,7 @@
       </w:rPr>
     </w:lvl>
   </w:abstractNum>
-  <w:abstractNum w:abstractNumId="7" w15:restartNumberingAfterBreak="0">
+  <w:abstractNum w:abstractNumId="9" w15:restartNumberingAfterBreak="0">
     <w:nsid w:val="162001B9"/>
     <w:multiLevelType w:val="multilevel"/>
     <w:tmpl w:val="799AA604"/>
@@ -2539,7 +4520,7 @@
       </w:rPr>
     </w:lvl>
   </w:abstractNum>
-  <w:abstractNum w:abstractNumId="8" w15:restartNumberingAfterBreak="0">
+  <w:abstractNum w:abstractNumId="10" w15:restartNumberingAfterBreak="0">
     <w:nsid w:val="167117D5"/>
     <w:multiLevelType w:val="multilevel"/>
     <w:tmpl w:val="E3F496BE"/>
@@ -2688,7 +4669,7 @@
       </w:rPr>
     </w:lvl>
   </w:abstractNum>
-  <w:abstractNum w:abstractNumId="9" w15:restartNumberingAfterBreak="0">
+  <w:abstractNum w:abstractNumId="11" w15:restartNumberingAfterBreak="0">
     <w:nsid w:val="18216C1E"/>
     <w:multiLevelType w:val="multilevel"/>
     <w:tmpl w:val="28081E22"/>
@@ -2837,7 +4818,7 @@
       </w:rPr>
     </w:lvl>
   </w:abstractNum>
-  <w:abstractNum w:abstractNumId="10" w15:restartNumberingAfterBreak="0">
+  <w:abstractNum w:abstractNumId="12" w15:restartNumberingAfterBreak="0">
     <w:nsid w:val="1D557881"/>
     <w:multiLevelType w:val="multilevel"/>
     <w:tmpl w:val="77B27590"/>
@@ -2986,7 +4967,7 @@
       </w:rPr>
     </w:lvl>
   </w:abstractNum>
-  <w:abstractNum w:abstractNumId="11" w15:restartNumberingAfterBreak="0">
+  <w:abstractNum w:abstractNumId="13" w15:restartNumberingAfterBreak="0">
     <w:nsid w:val="1DB60292"/>
     <w:multiLevelType w:val="multilevel"/>
     <w:tmpl w:val="B6D24A46"/>
@@ -3135,7 +5116,7 @@
       </w:rPr>
     </w:lvl>
   </w:abstractNum>
-  <w:abstractNum w:abstractNumId="12" w15:restartNumberingAfterBreak="0">
+  <w:abstractNum w:abstractNumId="14" w15:restartNumberingAfterBreak="0">
     <w:nsid w:val="1E170B79"/>
     <w:multiLevelType w:val="multilevel"/>
     <w:tmpl w:val="C1E4BEA8"/>
@@ -3284,7 +5265,7 @@
       </w:rPr>
     </w:lvl>
   </w:abstractNum>
-  <w:abstractNum w:abstractNumId="13" w15:restartNumberingAfterBreak="0">
+  <w:abstractNum w:abstractNumId="15" w15:restartNumberingAfterBreak="0">
     <w:nsid w:val="241B4745"/>
     <w:multiLevelType w:val="multilevel"/>
     <w:tmpl w:val="BD5031D6"/>
@@ -3433,7 +5414,7 @@
       </w:rPr>
     </w:lvl>
   </w:abstractNum>
-  <w:abstractNum w:abstractNumId="14" w15:restartNumberingAfterBreak="0">
+  <w:abstractNum w:abstractNumId="16" w15:restartNumberingAfterBreak="0">
     <w:nsid w:val="244106ED"/>
     <w:multiLevelType w:val="multilevel"/>
     <w:tmpl w:val="CA3E58FA"/>
@@ -3582,7 +5563,156 @@
       </w:rPr>
     </w:lvl>
   </w:abstractNum>
-  <w:abstractNum w:abstractNumId="15" w15:restartNumberingAfterBreak="0">
+  <w:abstractNum w:abstractNumId="17" w15:restartNumberingAfterBreak="0">
+    <w:nsid w:val="25E86CB5"/>
+    <w:multiLevelType w:val="multilevel"/>
+    <w:tmpl w:val="76AC32C6"/>
+    <w:lvl w:ilvl="0">
+      <w:start w:val="1"/>
+      <w:numFmt w:val="bullet"/>
+      <w:lvlText w:val=""/>
+      <w:lvlJc w:val="left"/>
+      <w:pPr>
+        <w:tabs>
+          <w:tab w:val="num" w:pos="720"/>
+        </w:tabs>
+        <w:ind w:left="720" w:hanging="360"/>
+      </w:pPr>
+      <w:rPr>
+        <w:rFonts w:ascii="Symbol" w:hAnsi="Symbol" w:hint="default"/>
+        <w:sz w:val="20"/>
+      </w:rPr>
+    </w:lvl>
+    <w:lvl w:ilvl="1" w:tentative="1">
+      <w:start w:val="1"/>
+      <w:numFmt w:val="bullet"/>
+      <w:lvlText w:val="o"/>
+      <w:lvlJc w:val="left"/>
+      <w:pPr>
+        <w:tabs>
+          <w:tab w:val="num" w:pos="1440"/>
+        </w:tabs>
+        <w:ind w:left="1440" w:hanging="360"/>
+      </w:pPr>
+      <w:rPr>
+        <w:rFonts w:ascii="Courier New" w:hAnsi="Courier New" w:hint="default"/>
+        <w:sz w:val="20"/>
+      </w:rPr>
+    </w:lvl>
+    <w:lvl w:ilvl="2" w:tentative="1">
+      <w:start w:val="1"/>
+      <w:numFmt w:val="bullet"/>
+      <w:lvlText w:val=""/>
+      <w:lvlJc w:val="left"/>
+      <w:pPr>
+        <w:tabs>
+          <w:tab w:val="num" w:pos="2160"/>
+        </w:tabs>
+        <w:ind w:left="2160" w:hanging="360"/>
+      </w:pPr>
+      <w:rPr>
+        <w:rFonts w:ascii="Wingdings" w:hAnsi="Wingdings" w:hint="default"/>
+        <w:sz w:val="20"/>
+      </w:rPr>
+    </w:lvl>
+    <w:lvl w:ilvl="3" w:tentative="1">
+      <w:start w:val="1"/>
+      <w:numFmt w:val="bullet"/>
+      <w:lvlText w:val=""/>
+      <w:lvlJc w:val="left"/>
+      <w:pPr>
+        <w:tabs>
+          <w:tab w:val="num" w:pos="2880"/>
+        </w:tabs>
+        <w:ind w:left="2880" w:hanging="360"/>
+      </w:pPr>
+      <w:rPr>
+        <w:rFonts w:ascii="Wingdings" w:hAnsi="Wingdings" w:hint="default"/>
+        <w:sz w:val="20"/>
+      </w:rPr>
+    </w:lvl>
+    <w:lvl w:ilvl="4" w:tentative="1">
+      <w:start w:val="1"/>
+      <w:numFmt w:val="bullet"/>
+      <w:lvlText w:val=""/>
+      <w:lvlJc w:val="left"/>
+      <w:pPr>
+        <w:tabs>
+          <w:tab w:val="num" w:pos="3600"/>
+        </w:tabs>
+        <w:ind w:left="3600" w:hanging="360"/>
+      </w:pPr>
+      <w:rPr>
+        <w:rFonts w:ascii="Wingdings" w:hAnsi="Wingdings" w:hint="default"/>
+        <w:sz w:val="20"/>
+      </w:rPr>
+    </w:lvl>
+    <w:lvl w:ilvl="5" w:tentative="1">
+      <w:start w:val="1"/>
+      <w:numFmt w:val="bullet"/>
+      <w:lvlText w:val=""/>
+      <w:lvlJc w:val="left"/>
+      <w:pPr>
+        <w:tabs>
+          <w:tab w:val="num" w:pos="4320"/>
+        </w:tabs>
+        <w:ind w:left="4320" w:hanging="360"/>
+      </w:pPr>
+      <w:rPr>
+        <w:rFonts w:ascii="Wingdings" w:hAnsi="Wingdings" w:hint="default"/>
+        <w:sz w:val="20"/>
+      </w:rPr>
+    </w:lvl>
+    <w:lvl w:ilvl="6" w:tentative="1">
+      <w:start w:val="1"/>
+      <w:numFmt w:val="bullet"/>
+      <w:lvlText w:val=""/>
+      <w:lvlJc w:val="left"/>
+      <w:pPr>
+        <w:tabs>
+          <w:tab w:val="num" w:pos="5040"/>
+        </w:tabs>
+        <w:ind w:left="5040" w:hanging="360"/>
+      </w:pPr>
+      <w:rPr>
+        <w:rFonts w:ascii="Wingdings" w:hAnsi="Wingdings" w:hint="default"/>
+        <w:sz w:val="20"/>
+      </w:rPr>
+    </w:lvl>
+    <w:lvl w:ilvl="7" w:tentative="1">
+      <w:start w:val="1"/>
+      <w:numFmt w:val="bullet"/>
+      <w:lvlText w:val=""/>
+      <w:lvlJc w:val="left"/>
+      <w:pPr>
+        <w:tabs>
+          <w:tab w:val="num" w:pos="5760"/>
+        </w:tabs>
+        <w:ind w:left="5760" w:hanging="360"/>
+      </w:pPr>
+      <w:rPr>
+        <w:rFonts w:ascii="Wingdings" w:hAnsi="Wingdings" w:hint="default"/>
+        <w:sz w:val="20"/>
+      </w:rPr>
+    </w:lvl>
+    <w:lvl w:ilvl="8" w:tentative="1">
+      <w:start w:val="1"/>
+      <w:numFmt w:val="bullet"/>
+      <w:lvlText w:val=""/>
+      <w:lvlJc w:val="left"/>
+      <w:pPr>
+        <w:tabs>
+          <w:tab w:val="num" w:pos="6480"/>
+        </w:tabs>
+        <w:ind w:left="6480" w:hanging="360"/>
+      </w:pPr>
+      <w:rPr>
+        <w:rFonts w:ascii="Wingdings" w:hAnsi="Wingdings" w:hint="default"/>
+        <w:sz w:val="20"/>
+      </w:rPr>
+    </w:lvl>
+  </w:abstractNum>
+  <w:abstractNum w:abstractNumId="18" w15:restartNumberingAfterBreak="0">
     <w:nsid w:val="2C4F114A"/>
     <w:multiLevelType w:val="multilevel"/>
     <w:tmpl w:val="CA444D68"/>
@@ -3731,7 +5861,7 @@
       </w:rPr>
     </w:lvl>
   </w:abstractNum>
-  <w:abstractNum w:abstractNumId="16" w15:restartNumberingAfterBreak="0">
+  <w:abstractNum w:abstractNumId="19" w15:restartNumberingAfterBreak="0">
     <w:nsid w:val="2F6326D2"/>
     <w:multiLevelType w:val="multilevel"/>
     <w:tmpl w:val="E83AB754"/>
@@ -3880,7 +6010,7 @@
       </w:rPr>
     </w:lvl>
   </w:abstractNum>
-  <w:abstractNum w:abstractNumId="17" w15:restartNumberingAfterBreak="0">
+  <w:abstractNum w:abstractNumId="20" w15:restartNumberingAfterBreak="0">
     <w:nsid w:val="30265362"/>
     <w:multiLevelType w:val="multilevel"/>
     <w:tmpl w:val="183E5D9A"/>
@@ -4029,7 +6159,7 @@
       </w:rPr>
     </w:lvl>
   </w:abstractNum>
-  <w:abstractNum w:abstractNumId="18" w15:restartNumberingAfterBreak="0">
+  <w:abstractNum w:abstractNumId="21" w15:restartNumberingAfterBreak="0">
     <w:nsid w:val="30457C86"/>
     <w:multiLevelType w:val="multilevel"/>
     <w:tmpl w:val="E7009432"/>
@@ -4178,7 +6308,7 @@
       </w:rPr>
     </w:lvl>
   </w:abstractNum>
-  <w:abstractNum w:abstractNumId="19" w15:restartNumberingAfterBreak="0">
+  <w:abstractNum w:abstractNumId="22" w15:restartNumberingAfterBreak="0">
     <w:nsid w:val="32E24D0B"/>
     <w:multiLevelType w:val="multilevel"/>
     <w:tmpl w:val="BC2A0A2E"/>
@@ -4327,7 +6457,7 @@
       </w:rPr>
     </w:lvl>
   </w:abstractNum>
-  <w:abstractNum w:abstractNumId="20" w15:restartNumberingAfterBreak="0">
+  <w:abstractNum w:abstractNumId="23" w15:restartNumberingAfterBreak="0">
     <w:nsid w:val="34AE3D85"/>
     <w:multiLevelType w:val="multilevel"/>
     <w:tmpl w:val="B3A676D0"/>
@@ -4476,7 +6606,7 @@
       </w:rPr>
     </w:lvl>
   </w:abstractNum>
-  <w:abstractNum w:abstractNumId="21" w15:restartNumberingAfterBreak="0">
+  <w:abstractNum w:abstractNumId="24" w15:restartNumberingAfterBreak="0">
     <w:nsid w:val="39F77100"/>
     <w:multiLevelType w:val="multilevel"/>
     <w:tmpl w:val="A7247CA2"/>
@@ -4625,7 +6755,7 @@
       </w:rPr>
     </w:lvl>
   </w:abstractNum>
-  <w:abstractNum w:abstractNumId="22" w15:restartNumberingAfterBreak="0">
+  <w:abstractNum w:abstractNumId="25" w15:restartNumberingAfterBreak="0">
     <w:nsid w:val="3AEB7940"/>
     <w:multiLevelType w:val="multilevel"/>
     <w:tmpl w:val="BF967C7E"/>
@@ -4774,7 +6904,7 @@
       </w:rPr>
     </w:lvl>
   </w:abstractNum>
-  <w:abstractNum w:abstractNumId="23" w15:restartNumberingAfterBreak="0">
+  <w:abstractNum w:abstractNumId="26" w15:restartNumberingAfterBreak="0">
     <w:nsid w:val="3B63096C"/>
     <w:multiLevelType w:val="multilevel"/>
     <w:tmpl w:val="4F7481EC"/>
@@ -4923,7 +7053,7 @@
       </w:rPr>
     </w:lvl>
   </w:abstractNum>
-  <w:abstractNum w:abstractNumId="24" w15:restartNumberingAfterBreak="0">
+  <w:abstractNum w:abstractNumId="27" w15:restartNumberingAfterBreak="0">
     <w:nsid w:val="401A6D4F"/>
     <w:multiLevelType w:val="multilevel"/>
     <w:tmpl w:val="80328838"/>
@@ -5072,7 +7202,7 @@
       </w:rPr>
     </w:lvl>
   </w:abstractNum>
-  <w:abstractNum w:abstractNumId="25" w15:restartNumberingAfterBreak="0">
+  <w:abstractNum w:abstractNumId="28" w15:restartNumberingAfterBreak="0">
     <w:nsid w:val="410930F7"/>
     <w:multiLevelType w:val="multilevel"/>
     <w:tmpl w:val="7090BA48"/>
@@ -5221,7 +7351,7 @@
       </w:rPr>
     </w:lvl>
   </w:abstractNum>
-  <w:abstractNum w:abstractNumId="26" w15:restartNumberingAfterBreak="0">
+  <w:abstractNum w:abstractNumId="29" w15:restartNumberingAfterBreak="0">
     <w:nsid w:val="42EF1980"/>
     <w:multiLevelType w:val="multilevel"/>
     <w:tmpl w:val="F0D8203A"/>
@@ -5370,7 +7500,156 @@
       </w:rPr>
     </w:lvl>
   </w:abstractNum>
-  <w:abstractNum w:abstractNumId="27" w15:restartNumberingAfterBreak="0">
+  <w:abstractNum w:abstractNumId="30" w15:restartNumberingAfterBreak="0">
+    <w:nsid w:val="44B800D7"/>
+    <w:multiLevelType w:val="multilevel"/>
+    <w:tmpl w:val="B44AFAE4"/>
+    <w:lvl w:ilvl="0">
+      <w:start w:val="1"/>
+      <w:numFmt w:val="bullet"/>
+      <w:lvlText w:val=""/>
+      <w:lvlJc w:val="left"/>
+      <w:pPr>
+        <w:tabs>
+          <w:tab w:val="num" w:pos="720"/>
+        </w:tabs>
+        <w:ind w:left="720" w:hanging="360"/>
+      </w:pPr>
+      <w:rPr>
+        <w:rFonts w:ascii="Symbol" w:hAnsi="Symbol" w:hint="default"/>
+        <w:sz w:val="20"/>
+      </w:rPr>
+    </w:lvl>
+    <w:lvl w:ilvl="1" w:tentative="1">
+      <w:start w:val="1"/>
+      <w:numFmt w:val="bullet"/>
+      <w:lvlText w:val="o"/>
+      <w:lvlJc w:val="left"/>
+      <w:pPr>
+        <w:tabs>
+          <w:tab w:val="num" w:pos="1440"/>
+        </w:tabs>
+        <w:ind w:left="1440" w:hanging="360"/>
+      </w:pPr>
+      <w:rPr>
+        <w:rFonts w:ascii="Courier New" w:hAnsi="Courier New" w:hint="default"/>
+        <w:sz w:val="20"/>
+      </w:rPr>
+    </w:lvl>
+    <w:lvl w:ilvl="2" w:tentative="1">
+      <w:start w:val="1"/>
+      <w:numFmt w:val="bullet"/>
+      <w:lvlText w:val=""/>
+      <w:lvlJc w:val="left"/>
+      <w:pPr>
+        <w:tabs>
+          <w:tab w:val="num" w:pos="2160"/>
+        </w:tabs>
+        <w:ind w:left="2160" w:hanging="360"/>
+      </w:pPr>
+      <w:rPr>
+        <w:rFonts w:ascii="Wingdings" w:hAnsi="Wingdings" w:hint="default"/>
+        <w:sz w:val="20"/>
+      </w:rPr>
+    </w:lvl>
+    <w:lvl w:ilvl="3" w:tentative="1">
+      <w:start w:val="1"/>
+      <w:numFmt w:val="bullet"/>
+      <w:lvlText w:val=""/>
+      <w:lvlJc w:val="left"/>
+      <w:pPr>
+        <w:tabs>
+          <w:tab w:val="num" w:pos="2880"/>
+        </w:tabs>
+        <w:ind w:left="2880" w:hanging="360"/>
+      </w:pPr>
+      <w:rPr>
+        <w:rFonts w:ascii="Wingdings" w:hAnsi="Wingdings" w:hint="default"/>
+        <w:sz w:val="20"/>
+      </w:rPr>
+    </w:lvl>
+    <w:lvl w:ilvl="4" w:tentative="1">
+      <w:start w:val="1"/>
+      <w:numFmt w:val="bullet"/>
+      <w:lvlText w:val=""/>
+      <w:lvlJc w:val="left"/>
+      <w:pPr>
+        <w:tabs>
+          <w:tab w:val="num" w:pos="3600"/>
+        </w:tabs>
+        <w:ind w:left="3600" w:hanging="360"/>
+      </w:pPr>
+      <w:rPr>
+        <w:rFonts w:ascii="Wingdings" w:hAnsi="Wingdings" w:hint="default"/>
+        <w:sz w:val="20"/>
+      </w:rPr>
+    </w:lvl>
+    <w:lvl w:ilvl="5" w:tentative="1">
+      <w:start w:val="1"/>
+      <w:numFmt w:val="bullet"/>
+      <w:lvlText w:val=""/>
+      <w:lvlJc w:val="left"/>
+      <w:pPr>
+        <w:tabs>
+          <w:tab w:val="num" w:pos="4320"/>
+        </w:tabs>
+        <w:ind w:left="4320" w:hanging="360"/>
+      </w:pPr>
+      <w:rPr>
+        <w:rFonts w:ascii="Wingdings" w:hAnsi="Wingdings" w:hint="default"/>
+        <w:sz w:val="20"/>
+      </w:rPr>
+    </w:lvl>
+    <w:lvl w:ilvl="6" w:tentative="1">
+      <w:start w:val="1"/>
+      <w:numFmt w:val="bullet"/>
+      <w:lvlText w:val=""/>
+      <w:lvlJc w:val="left"/>
+      <w:pPr>
+        <w:tabs>
+          <w:tab w:val="num" w:pos="5040"/>
+        </w:tabs>
+        <w:ind w:left="5040" w:hanging="360"/>
+      </w:pPr>
+      <w:rPr>
+        <w:rFonts w:ascii="Wingdings" w:hAnsi="Wingdings" w:hint="default"/>
+        <w:sz w:val="20"/>
+      </w:rPr>
+    </w:lvl>
+    <w:lvl w:ilvl="7" w:tentative="1">
+      <w:start w:val="1"/>
+      <w:numFmt w:val="bullet"/>
+      <w:lvlText w:val=""/>
+      <w:lvlJc w:val="left"/>
+      <w:pPr>
+        <w:tabs>
+          <w:tab w:val="num" w:pos="5760"/>
+        </w:tabs>
+        <w:ind w:left="5760" w:hanging="360"/>
+      </w:pPr>
+      <w:rPr>
+        <w:rFonts w:ascii="Wingdings" w:hAnsi="Wingdings" w:hint="default"/>
+        <w:sz w:val="20"/>
+      </w:rPr>
+    </w:lvl>
+    <w:lvl w:ilvl="8" w:tentative="1">
+      <w:start w:val="1"/>
+      <w:numFmt w:val="bullet"/>
+      <w:lvlText w:val=""/>
+      <w:lvlJc w:val="left"/>
+      <w:pPr>
+        <w:tabs>
+          <w:tab w:val="num" w:pos="6480"/>
+        </w:tabs>
+        <w:ind w:left="6480" w:hanging="360"/>
+      </w:pPr>
+      <w:rPr>
+        <w:rFonts w:ascii="Wingdings" w:hAnsi="Wingdings" w:hint="default"/>
+        <w:sz w:val="20"/>
+      </w:rPr>
+    </w:lvl>
+  </w:abstractNum>
+  <w:abstractNum w:abstractNumId="31" w15:restartNumberingAfterBreak="0">
     <w:nsid w:val="458B25E0"/>
     <w:multiLevelType w:val="multilevel"/>
     <w:tmpl w:val="79C893D4"/>
@@ -5519,7 +7798,7 @@
       </w:rPr>
     </w:lvl>
   </w:abstractNum>
-  <w:abstractNum w:abstractNumId="28" w15:restartNumberingAfterBreak="0">
+  <w:abstractNum w:abstractNumId="32" w15:restartNumberingAfterBreak="0">
     <w:nsid w:val="459066B0"/>
     <w:multiLevelType w:val="multilevel"/>
     <w:tmpl w:val="825C7A52"/>
@@ -5668,7 +7947,7 @@
       </w:rPr>
     </w:lvl>
   </w:abstractNum>
-  <w:abstractNum w:abstractNumId="29" w15:restartNumberingAfterBreak="0">
+  <w:abstractNum w:abstractNumId="33" w15:restartNumberingAfterBreak="0">
     <w:nsid w:val="4AC93B4D"/>
     <w:multiLevelType w:val="multilevel"/>
     <w:tmpl w:val="562A01F0"/>
@@ -5817,7 +8096,7 @@
       </w:rPr>
     </w:lvl>
   </w:abstractNum>
-  <w:abstractNum w:abstractNumId="30" w15:restartNumberingAfterBreak="0">
+  <w:abstractNum w:abstractNumId="34" w15:restartNumberingAfterBreak="0">
     <w:nsid w:val="4E0B437D"/>
     <w:multiLevelType w:val="multilevel"/>
     <w:tmpl w:val="B254C32A"/>
@@ -5966,7 +8245,7 @@
       </w:rPr>
     </w:lvl>
   </w:abstractNum>
-  <w:abstractNum w:abstractNumId="31" w15:restartNumberingAfterBreak="0">
+  <w:abstractNum w:abstractNumId="35" w15:restartNumberingAfterBreak="0">
     <w:nsid w:val="51805833"/>
     <w:multiLevelType w:val="multilevel"/>
     <w:tmpl w:val="AC306172"/>
@@ -6115,7 +8394,156 @@
       </w:rPr>
     </w:lvl>
   </w:abstractNum>
-  <w:abstractNum w:abstractNumId="32" w15:restartNumberingAfterBreak="0">
+  <w:abstractNum w:abstractNumId="36" w15:restartNumberingAfterBreak="0">
+    <w:nsid w:val="539A0225"/>
+    <w:multiLevelType w:val="multilevel"/>
+    <w:tmpl w:val="E5188442"/>
+    <w:lvl w:ilvl="0">
+      <w:start w:val="1"/>
+      <w:numFmt w:val="bullet"/>
+      <w:lvlText w:val=""/>
+      <w:lvlJc w:val="left"/>
+      <w:pPr>
+        <w:tabs>
+          <w:tab w:val="num" w:pos="720"/>
+        </w:tabs>
+        <w:ind w:left="720" w:hanging="360"/>
+      </w:pPr>
+      <w:rPr>
+        <w:rFonts w:ascii="Symbol" w:hAnsi="Symbol" w:hint="default"/>
+        <w:sz w:val="20"/>
+      </w:rPr>
+    </w:lvl>
+    <w:lvl w:ilvl="1" w:tentative="1">
+      <w:start w:val="1"/>
+      <w:numFmt w:val="bullet"/>
+      <w:lvlText w:val="o"/>
+      <w:lvlJc w:val="left"/>
+      <w:pPr>
+        <w:tabs>
+          <w:tab w:val="num" w:pos="1440"/>
+        </w:tabs>
+        <w:ind w:left="1440" w:hanging="360"/>
+      </w:pPr>
+      <w:rPr>
+        <w:rFonts w:ascii="Courier New" w:hAnsi="Courier New" w:hint="default"/>
+        <w:sz w:val="20"/>
+      </w:rPr>
+    </w:lvl>
+    <w:lvl w:ilvl="2" w:tentative="1">
+      <w:start w:val="1"/>
+      <w:numFmt w:val="bullet"/>
+      <w:lvlText w:val=""/>
+      <w:lvlJc w:val="left"/>
+      <w:pPr>
+        <w:tabs>
+          <w:tab w:val="num" w:pos="2160"/>
+        </w:tabs>
+        <w:ind w:left="2160" w:hanging="360"/>
+      </w:pPr>
+      <w:rPr>
+        <w:rFonts w:ascii="Wingdings" w:hAnsi="Wingdings" w:hint="default"/>
+        <w:sz w:val="20"/>
+      </w:rPr>
+    </w:lvl>
+    <w:lvl w:ilvl="3" w:tentative="1">
+      <w:start w:val="1"/>
+      <w:numFmt w:val="bullet"/>
+      <w:lvlText w:val=""/>
+      <w:lvlJc w:val="left"/>
+      <w:pPr>
+        <w:tabs>
+          <w:tab w:val="num" w:pos="2880"/>
+        </w:tabs>
+        <w:ind w:left="2880" w:hanging="360"/>
+      </w:pPr>
+      <w:rPr>
+        <w:rFonts w:ascii="Wingdings" w:hAnsi="Wingdings" w:hint="default"/>
+        <w:sz w:val="20"/>
+      </w:rPr>
+    </w:lvl>
+    <w:lvl w:ilvl="4" w:tentative="1">
+      <w:start w:val="1"/>
+      <w:numFmt w:val="bullet"/>
+      <w:lvlText w:val=""/>
+      <w:lvlJc w:val="left"/>
+      <w:pPr>
+        <w:tabs>
+          <w:tab w:val="num" w:pos="3600"/>
+        </w:tabs>
+        <w:ind w:left="3600" w:hanging="360"/>
+      </w:pPr>
+      <w:rPr>
+        <w:rFonts w:ascii="Wingdings" w:hAnsi="Wingdings" w:hint="default"/>
+        <w:sz w:val="20"/>
+      </w:rPr>
+    </w:lvl>
+    <w:lvl w:ilvl="5" w:tentative="1">
+      <w:start w:val="1"/>
+      <w:numFmt w:val="bullet"/>
+      <w:lvlText w:val=""/>
+      <w:lvlJc w:val="left"/>
+      <w:pPr>
+        <w:tabs>
+          <w:tab w:val="num" w:pos="4320"/>
+        </w:tabs>
+        <w:ind w:left="4320" w:hanging="360"/>
+      </w:pPr>
+      <w:rPr>
+        <w:rFonts w:ascii="Wingdings" w:hAnsi="Wingdings" w:hint="default"/>
+        <w:sz w:val="20"/>
+      </w:rPr>
+    </w:lvl>
+    <w:lvl w:ilvl="6" w:tentative="1">
+      <w:start w:val="1"/>
+      <w:numFmt w:val="bullet"/>
+      <w:lvlText w:val=""/>
+      <w:lvlJc w:val="left"/>
+      <w:pPr>
+        <w:tabs>
+          <w:tab w:val="num" w:pos="5040"/>
+        </w:tabs>
+        <w:ind w:left="5040" w:hanging="360"/>
+      </w:pPr>
+      <w:rPr>
+        <w:rFonts w:ascii="Wingdings" w:hAnsi="Wingdings" w:hint="default"/>
+        <w:sz w:val="20"/>
+      </w:rPr>
+    </w:lvl>
+    <w:lvl w:ilvl="7" w:tentative="1">
+      <w:start w:val="1"/>
+      <w:numFmt w:val="bullet"/>
+      <w:lvlText w:val=""/>
+      <w:lvlJc w:val="left"/>
+      <w:pPr>
+        <w:tabs>
+          <w:tab w:val="num" w:pos="5760"/>
+        </w:tabs>
+        <w:ind w:left="5760" w:hanging="360"/>
+      </w:pPr>
+      <w:rPr>
+        <w:rFonts w:ascii="Wingdings" w:hAnsi="Wingdings" w:hint="default"/>
+        <w:sz w:val="20"/>
+      </w:rPr>
+    </w:lvl>
+    <w:lvl w:ilvl="8" w:tentative="1">
+      <w:start w:val="1"/>
+      <w:numFmt w:val="bullet"/>
+      <w:lvlText w:val=""/>
+      <w:lvlJc w:val="left"/>
+      <w:pPr>
+        <w:tabs>
+          <w:tab w:val="num" w:pos="6480"/>
+        </w:tabs>
+        <w:ind w:left="6480" w:hanging="360"/>
+      </w:pPr>
+      <w:rPr>
+        <w:rFonts w:ascii="Wingdings" w:hAnsi="Wingdings" w:hint="default"/>
+        <w:sz w:val="20"/>
+      </w:rPr>
+    </w:lvl>
+  </w:abstractNum>
+  <w:abstractNum w:abstractNumId="37" w15:restartNumberingAfterBreak="0">
     <w:nsid w:val="549F288D"/>
     <w:multiLevelType w:val="multilevel"/>
     <w:tmpl w:val="E494B670"/>
@@ -6264,7 +8692,7 @@
       </w:rPr>
     </w:lvl>
   </w:abstractNum>
-  <w:abstractNum w:abstractNumId="33" w15:restartNumberingAfterBreak="0">
+  <w:abstractNum w:abstractNumId="38" w15:restartNumberingAfterBreak="0">
     <w:nsid w:val="57297518"/>
     <w:multiLevelType w:val="multilevel"/>
     <w:tmpl w:val="B422F55A"/>
@@ -6413,7 +8841,7 @@
       </w:rPr>
     </w:lvl>
   </w:abstractNum>
-  <w:abstractNum w:abstractNumId="34" w15:restartNumberingAfterBreak="0">
+  <w:abstractNum w:abstractNumId="39" w15:restartNumberingAfterBreak="0">
     <w:nsid w:val="59BD6F75"/>
     <w:multiLevelType w:val="multilevel"/>
     <w:tmpl w:val="4818203A"/>
@@ -6562,7 +8990,7 @@
       </w:rPr>
     </w:lvl>
   </w:abstractNum>
-  <w:abstractNum w:abstractNumId="35" w15:restartNumberingAfterBreak="0">
+  <w:abstractNum w:abstractNumId="40" w15:restartNumberingAfterBreak="0">
     <w:nsid w:val="5D857F67"/>
     <w:multiLevelType w:val="multilevel"/>
     <w:tmpl w:val="A994265C"/>
@@ -6711,7 +9139,7 @@
       </w:rPr>
     </w:lvl>
   </w:abstractNum>
-  <w:abstractNum w:abstractNumId="36" w15:restartNumberingAfterBreak="0">
+  <w:abstractNum w:abstractNumId="41" w15:restartNumberingAfterBreak="0">
     <w:nsid w:val="61F257D3"/>
     <w:multiLevelType w:val="multilevel"/>
     <w:tmpl w:val="06FA1C90"/>
@@ -6860,7 +9288,7 @@
       </w:rPr>
     </w:lvl>
   </w:abstractNum>
-  <w:abstractNum w:abstractNumId="37" w15:restartNumberingAfterBreak="0">
+  <w:abstractNum w:abstractNumId="42" w15:restartNumberingAfterBreak="0">
     <w:nsid w:val="646E2B27"/>
     <w:multiLevelType w:val="multilevel"/>
     <w:tmpl w:val="7A209DEA"/>
@@ -7009,7 +9437,7 @@
       </w:rPr>
     </w:lvl>
   </w:abstractNum>
-  <w:abstractNum w:abstractNumId="38" w15:restartNumberingAfterBreak="0">
+  <w:abstractNum w:abstractNumId="43" w15:restartNumberingAfterBreak="0">
     <w:nsid w:val="67642B26"/>
     <w:multiLevelType w:val="multilevel"/>
     <w:tmpl w:val="33547730"/>
@@ -7158,7 +9586,7 @@
       </w:rPr>
     </w:lvl>
   </w:abstractNum>
-  <w:abstractNum w:abstractNumId="39" w15:restartNumberingAfterBreak="0">
+  <w:abstractNum w:abstractNumId="44" w15:restartNumberingAfterBreak="0">
     <w:nsid w:val="6AB56881"/>
     <w:multiLevelType w:val="multilevel"/>
     <w:tmpl w:val="E7984EA8"/>
@@ -7307,7 +9735,7 @@
       </w:rPr>
     </w:lvl>
   </w:abstractNum>
-  <w:abstractNum w:abstractNumId="40" w15:restartNumberingAfterBreak="0">
+  <w:abstractNum w:abstractNumId="45" w15:restartNumberingAfterBreak="0">
     <w:nsid w:val="6DB34519"/>
     <w:multiLevelType w:val="multilevel"/>
     <w:tmpl w:val="34B0CF4C"/>
@@ -7456,7 +9884,7 @@
       </w:rPr>
     </w:lvl>
   </w:abstractNum>
-  <w:abstractNum w:abstractNumId="41" w15:restartNumberingAfterBreak="0">
+  <w:abstractNum w:abstractNumId="46" w15:restartNumberingAfterBreak="0">
     <w:nsid w:val="6F304101"/>
     <w:multiLevelType w:val="multilevel"/>
     <w:tmpl w:val="2B0E387A"/>
@@ -7605,7 +10033,7 @@
       </w:rPr>
     </w:lvl>
   </w:abstractNum>
-  <w:abstractNum w:abstractNumId="42" w15:restartNumberingAfterBreak="0">
+  <w:abstractNum w:abstractNumId="47" w15:restartNumberingAfterBreak="0">
     <w:nsid w:val="716F7331"/>
     <w:multiLevelType w:val="multilevel"/>
     <w:tmpl w:val="EE9CA04E"/>
@@ -7754,7 +10182,7 @@
       </w:rPr>
     </w:lvl>
   </w:abstractNum>
-  <w:abstractNum w:abstractNumId="43" w15:restartNumberingAfterBreak="0">
+  <w:abstractNum w:abstractNumId="48" w15:restartNumberingAfterBreak="0">
     <w:nsid w:val="72364439"/>
     <w:multiLevelType w:val="multilevel"/>
     <w:tmpl w:val="2140E488"/>
@@ -7903,7 +10331,7 @@
       </w:rPr>
     </w:lvl>
   </w:abstractNum>
-  <w:abstractNum w:abstractNumId="44" w15:restartNumberingAfterBreak="0">
+  <w:abstractNum w:abstractNumId="49" w15:restartNumberingAfterBreak="0">
     <w:nsid w:val="760E3C79"/>
     <w:multiLevelType w:val="multilevel"/>
     <w:tmpl w:val="4C4A1644"/>
@@ -8052,7 +10480,7 @@
       </w:rPr>
     </w:lvl>
   </w:abstractNum>
-  <w:abstractNum w:abstractNumId="45" w15:restartNumberingAfterBreak="0">
+  <w:abstractNum w:abstractNumId="50" w15:restartNumberingAfterBreak="0">
     <w:nsid w:val="77CB6CBF"/>
     <w:multiLevelType w:val="multilevel"/>
     <w:tmpl w:val="5DB688DA"/>
@@ -8201,7 +10629,7 @@
       </w:rPr>
     </w:lvl>
   </w:abstractNum>
-  <w:abstractNum w:abstractNumId="46" w15:restartNumberingAfterBreak="0">
+  <w:abstractNum w:abstractNumId="51" w15:restartNumberingAfterBreak="0">
     <w:nsid w:val="79A20514"/>
     <w:multiLevelType w:val="multilevel"/>
     <w:tmpl w:val="1F7AF9B6"/>
@@ -8350,7 +10778,7 @@
       </w:rPr>
     </w:lvl>
   </w:abstractNum>
-  <w:abstractNum w:abstractNumId="47" w15:restartNumberingAfterBreak="0">
+  <w:abstractNum w:abstractNumId="52" w15:restartNumberingAfterBreak="0">
     <w:nsid w:val="7BB063EB"/>
     <w:multiLevelType w:val="multilevel"/>
     <w:tmpl w:val="E9200974"/>
@@ -8499,7 +10927,7 @@
       </w:rPr>
     </w:lvl>
   </w:abstractNum>
-  <w:abstractNum w:abstractNumId="48" w15:restartNumberingAfterBreak="0">
+  <w:abstractNum w:abstractNumId="53" w15:restartNumberingAfterBreak="0">
     <w:nsid w:val="7EF55C05"/>
     <w:multiLevelType w:val="multilevel"/>
     <w:tmpl w:val="FD068346"/>
@@ -8649,151 +11077,166 @@
     </w:lvl>
   </w:abstractNum>
   <w:num w:numId="1" w16cid:durableId="2056657636">
+    <w:abstractNumId w:val="13"/>
+  </w:num>
+  <w:num w:numId="2" w16cid:durableId="1502355509">
+    <w:abstractNumId w:val="35"/>
+  </w:num>
+  <w:num w:numId="3" w16cid:durableId="174616858">
+    <w:abstractNumId w:val="28"/>
+  </w:num>
+  <w:num w:numId="4" w16cid:durableId="1397120360">
+    <w:abstractNumId w:val="29"/>
+  </w:num>
+  <w:num w:numId="5" w16cid:durableId="1806115274">
+    <w:abstractNumId w:val="21"/>
+  </w:num>
+  <w:num w:numId="6" w16cid:durableId="1421639204">
+    <w:abstractNumId w:val="49"/>
+  </w:num>
+  <w:num w:numId="7" w16cid:durableId="878392449">
+    <w:abstractNumId w:val="3"/>
+  </w:num>
+  <w:num w:numId="8" w16cid:durableId="787360606">
+    <w:abstractNumId w:val="51"/>
+  </w:num>
+  <w:num w:numId="9" w16cid:durableId="255479042">
+    <w:abstractNumId w:val="45"/>
+  </w:num>
+  <w:num w:numId="10" w16cid:durableId="1211578690">
+    <w:abstractNumId w:val="10"/>
+  </w:num>
+  <w:num w:numId="11" w16cid:durableId="1594967954">
+    <w:abstractNumId w:val="31"/>
+  </w:num>
+  <w:num w:numId="12" w16cid:durableId="963197863">
+    <w:abstractNumId w:val="50"/>
+  </w:num>
+  <w:num w:numId="13" w16cid:durableId="1144010649">
+    <w:abstractNumId w:val="23"/>
+  </w:num>
+  <w:num w:numId="14" w16cid:durableId="1536773980">
+    <w:abstractNumId w:val="12"/>
+  </w:num>
+  <w:num w:numId="15" w16cid:durableId="1920824434">
+    <w:abstractNumId w:val="24"/>
+  </w:num>
+  <w:num w:numId="16" w16cid:durableId="1469854275">
+    <w:abstractNumId w:val="2"/>
+  </w:num>
+  <w:num w:numId="17" w16cid:durableId="978077664">
+    <w:abstractNumId w:val="47"/>
+  </w:num>
+  <w:num w:numId="18" w16cid:durableId="213540824">
+    <w:abstractNumId w:val="46"/>
+  </w:num>
+  <w:num w:numId="19" w16cid:durableId="1088961793">
     <w:abstractNumId w:val="11"/>
   </w:num>
-  <w:num w:numId="2" w16cid:durableId="1502355509">
-    <w:abstractNumId w:val="31"/>
+  <w:num w:numId="20" w16cid:durableId="1860047817">
+    <w:abstractNumId w:val="14"/>
   </w:num>
-  <w:num w:numId="3" w16cid:durableId="174616858">
+  <w:num w:numId="21" w16cid:durableId="1865628955">
+    <w:abstractNumId w:val="22"/>
+  </w:num>
+  <w:num w:numId="22" w16cid:durableId="1670013302">
+    <w:abstractNumId w:val="48"/>
+  </w:num>
+  <w:num w:numId="23" w16cid:durableId="2037849892">
+    <w:abstractNumId w:val="18"/>
+  </w:num>
+  <w:num w:numId="24" w16cid:durableId="1622683626">
+    <w:abstractNumId w:val="42"/>
+  </w:num>
+  <w:num w:numId="25" w16cid:durableId="310910895">
+    <w:abstractNumId w:val="40"/>
+  </w:num>
+  <w:num w:numId="26" w16cid:durableId="441805766">
+    <w:abstractNumId w:val="15"/>
+  </w:num>
+  <w:num w:numId="27" w16cid:durableId="394859020">
+    <w:abstractNumId w:val="8"/>
+  </w:num>
+  <w:num w:numId="28" w16cid:durableId="1120107946">
+    <w:abstractNumId w:val="9"/>
+  </w:num>
+  <w:num w:numId="29" w16cid:durableId="1436365051">
+    <w:abstractNumId w:val="34"/>
+  </w:num>
+  <w:num w:numId="30" w16cid:durableId="1529634769">
+    <w:abstractNumId w:val="39"/>
+  </w:num>
+  <w:num w:numId="31" w16cid:durableId="620184676">
+    <w:abstractNumId w:val="27"/>
+  </w:num>
+  <w:num w:numId="32" w16cid:durableId="573003942">
+    <w:abstractNumId w:val="41"/>
+  </w:num>
+  <w:num w:numId="33" w16cid:durableId="1938832364">
+    <w:abstractNumId w:val="7"/>
+  </w:num>
+  <w:num w:numId="34" w16cid:durableId="1252817496">
+    <w:abstractNumId w:val="53"/>
+  </w:num>
+  <w:num w:numId="35" w16cid:durableId="441651458">
+    <w:abstractNumId w:val="38"/>
+  </w:num>
+  <w:num w:numId="36" w16cid:durableId="1721981697">
+    <w:abstractNumId w:val="26"/>
+  </w:num>
+  <w:num w:numId="37" w16cid:durableId="1660310611">
+    <w:abstractNumId w:val="5"/>
+  </w:num>
+  <w:num w:numId="38" w16cid:durableId="1362558990">
+    <w:abstractNumId w:val="33"/>
+  </w:num>
+  <w:num w:numId="39" w16cid:durableId="966621483">
     <w:abstractNumId w:val="25"/>
   </w:num>
-  <w:num w:numId="4" w16cid:durableId="1397120360">
-    <w:abstractNumId w:val="26"/>
+  <w:num w:numId="40" w16cid:durableId="152189291">
+    <w:abstractNumId w:val="32"/>
   </w:num>
-  <w:num w:numId="5" w16cid:durableId="1806115274">
-    <w:abstractNumId w:val="18"/>
+  <w:num w:numId="41" w16cid:durableId="1885866593">
+    <w:abstractNumId w:val="1"/>
   </w:num>
-  <w:num w:numId="6" w16cid:durableId="1421639204">
+  <w:num w:numId="42" w16cid:durableId="62608683">
+    <w:abstractNumId w:val="43"/>
+  </w:num>
+  <w:num w:numId="43" w16cid:durableId="704912817">
+    <w:abstractNumId w:val="4"/>
+  </w:num>
+  <w:num w:numId="44" w16cid:durableId="1072119522">
+    <w:abstractNumId w:val="37"/>
+  </w:num>
+  <w:num w:numId="45" w16cid:durableId="440876595">
+    <w:abstractNumId w:val="20"/>
+  </w:num>
+  <w:num w:numId="46" w16cid:durableId="82847534">
     <w:abstractNumId w:val="44"/>
   </w:num>
-  <w:num w:numId="7" w16cid:durableId="878392449">
-    <w:abstractNumId w:val="2"/>
-  </w:num>
-  <w:num w:numId="8" w16cid:durableId="787360606">
-    <w:abstractNumId w:val="46"/>
-  </w:num>
-  <w:num w:numId="9" w16cid:durableId="255479042">
-    <w:abstractNumId w:val="40"/>
-  </w:num>
-  <w:num w:numId="10" w16cid:durableId="1211578690">
-    <w:abstractNumId w:val="8"/>
-  </w:num>
-  <w:num w:numId="11" w16cid:durableId="1594967954">
-    <w:abstractNumId w:val="27"/>
-  </w:num>
-  <w:num w:numId="12" w16cid:durableId="963197863">
-    <w:abstractNumId w:val="45"/>
-  </w:num>
-  <w:num w:numId="13" w16cid:durableId="1144010649">
-    <w:abstractNumId w:val="20"/>
-  </w:num>
-  <w:num w:numId="14" w16cid:durableId="1536773980">
-    <w:abstractNumId w:val="10"/>
-  </w:num>
-  <w:num w:numId="15" w16cid:durableId="1920824434">
-    <w:abstractNumId w:val="21"/>
-  </w:num>
-  <w:num w:numId="16" w16cid:durableId="1469854275">
-    <w:abstractNumId w:val="1"/>
-  </w:num>
-  <w:num w:numId="17" w16cid:durableId="978077664">
-    <w:abstractNumId w:val="42"/>
-  </w:num>
-  <w:num w:numId="18" w16cid:durableId="213540824">
-    <w:abstractNumId w:val="41"/>
-  </w:num>
-  <w:num w:numId="19" w16cid:durableId="1088961793">
-    <w:abstractNumId w:val="9"/>
-  </w:num>
-  <w:num w:numId="20" w16cid:durableId="1860047817">
-    <w:abstractNumId w:val="12"/>
-  </w:num>
-  <w:num w:numId="21" w16cid:durableId="1865628955">
+  <w:num w:numId="47" w16cid:durableId="1351375071">
     <w:abstractNumId w:val="19"/>
   </w:num>
-  <w:num w:numId="22" w16cid:durableId="1670013302">
-    <w:abstractNumId w:val="43"/>
+  <w:num w:numId="48" w16cid:durableId="1716272208">
+    <w:abstractNumId w:val="16"/>
   </w:num>
-  <w:num w:numId="23" w16cid:durableId="2037849892">
-    <w:abstractNumId w:val="15"/>
+  <w:num w:numId="49" w16cid:durableId="29965416">
+    <w:abstractNumId w:val="52"/>
   </w:num>
-  <w:num w:numId="24" w16cid:durableId="1622683626">
-    <w:abstractNumId w:val="37"/>
+  <w:num w:numId="50" w16cid:durableId="514224988">
+    <w:abstractNumId w:val="17"/>
   </w:num>
-  <w:num w:numId="25" w16cid:durableId="310910895">
-    <w:abstractNumId w:val="35"/>
+  <w:num w:numId="51" w16cid:durableId="976034203">
+    <w:abstractNumId w:val="36"/>
   </w:num>
-  <w:num w:numId="26" w16cid:durableId="441805766">
-    <w:abstractNumId w:val="13"/>
-  </w:num>
-  <w:num w:numId="27" w16cid:durableId="394859020">
+  <w:num w:numId="52" w16cid:durableId="531649384">
     <w:abstractNumId w:val="6"/>
   </w:num>
-  <w:num w:numId="28" w16cid:durableId="1120107946">
-    <w:abstractNumId w:val="7"/>
-  </w:num>
-  <w:num w:numId="29" w16cid:durableId="1436365051">
-    <w:abstractNumId w:val="30"/>
-  </w:num>
-  <w:num w:numId="30" w16cid:durableId="1529634769">
-    <w:abstractNumId w:val="34"/>
-  </w:num>
-  <w:num w:numId="31" w16cid:durableId="620184676">
-    <w:abstractNumId w:val="24"/>
-  </w:num>
-  <w:num w:numId="32" w16cid:durableId="573003942">
-    <w:abstractNumId w:val="36"/>
-  </w:num>
-  <w:num w:numId="33" w16cid:durableId="1938832364">
-    <w:abstractNumId w:val="5"/>
-  </w:num>
-  <w:num w:numId="34" w16cid:durableId="1252817496">
-    <w:abstractNumId w:val="48"/>
-  </w:num>
-  <w:num w:numId="35" w16cid:durableId="441651458">
-    <w:abstractNumId w:val="33"/>
-  </w:num>
-  <w:num w:numId="36" w16cid:durableId="1721981697">
-    <w:abstractNumId w:val="23"/>
-  </w:num>
-  <w:num w:numId="37" w16cid:durableId="1660310611">
-    <w:abstractNumId w:val="4"/>
-  </w:num>
-  <w:num w:numId="38" w16cid:durableId="1362558990">
-    <w:abstractNumId w:val="29"/>
-  </w:num>
-  <w:num w:numId="39" w16cid:durableId="966621483">
-    <w:abstractNumId w:val="22"/>
-  </w:num>
-  <w:num w:numId="40" w16cid:durableId="152189291">
-    <w:abstractNumId w:val="28"/>
-  </w:num>
-  <w:num w:numId="41" w16cid:durableId="1885866593">
+  <w:num w:numId="53" w16cid:durableId="1170759627">
     <w:abstractNumId w:val="0"/>
   </w:num>
-  <w:num w:numId="42" w16cid:durableId="62608683">
-    <w:abstractNumId w:val="38"/>
-  </w:num>
-  <w:num w:numId="43" w16cid:durableId="704912817">
-    <w:abstractNumId w:val="3"/>
-  </w:num>
-  <w:num w:numId="44" w16cid:durableId="1072119522">
-    <w:abstractNumId w:val="32"/>
-  </w:num>
-  <w:num w:numId="45" w16cid:durableId="440876595">
-    <w:abstractNumId w:val="17"/>
-  </w:num>
-  <w:num w:numId="46" w16cid:durableId="82847534">
-    <w:abstractNumId w:val="39"/>
-  </w:num>
-  <w:num w:numId="47" w16cid:durableId="1351375071">
-    <w:abstractNumId w:val="16"/>
-  </w:num>
-  <w:num w:numId="48" w16cid:durableId="1716272208">
-    <w:abstractNumId w:val="14"/>
-  </w:num>
-  <w:num w:numId="49" w16cid:durableId="29965416">
-    <w:abstractNumId w:val="47"/>
+  <w:num w:numId="54" w16cid:durableId="1565992146">
+    <w:abstractNumId w:val="30"/>
   </w:num>
 </w:numbering>
 </file>

</xml_diff>